<commit_message>
Update user manual, add AI integration docs, untrack .claude settings
Co-Authored-By: Claude Sonnet 4.6 <noreply@anthropic.com>
</commit_message>
<xml_diff>
--- a/docs/manual/Pharma-Glimmora-AI-Manual.docx
+++ b/docs/manual/Pharma-Glimmora-AI-Manual.docx
@@ -10,7 +10,7 @@
         <w:rPr>
           <w:b/>
           <w:color w:val="8B6914"/>
-          <w:sz w:val="56"/>
+          <w:sz w:val="52"/>
         </w:rPr>
         <w:t>Pharma Glimmora</w:t>
       </w:r>
@@ -22,12 +22,24 @@
       <w:r>
         <w:rPr>
           <w:color w:val="302D29"/>
-          <w:sz w:val="32"/>
+          <w:sz w:val="36"/>
         </w:rPr>
-        <w:t>AI Backend Integration — User Manual</w:t>
+        <w:t>AI Backend — Full User Manual</w:t>
       </w:r>
     </w:p>
-    <w:p/>
+    <w:p>
+      <w:pPr>
+        <w:jc w:val="center"/>
+      </w:pPr>
+      <w:r>
+        <w:rPr>
+          <w:i/>
+          <w:color w:val="64748B"/>
+          <w:sz w:val="22"/>
+        </w:rPr>
+        <w:t>End-to-end walkthrough for manual testing</w:t>
+      </w:r>
+    </w:p>
     <w:p>
       <w:pPr>
         <w:jc w:val="center"/>
@@ -35,22 +47,9 @@
       <w:r>
         <w:rPr>
           <w:color w:val="64748B"/>
-          <w:sz w:val="20"/>
+          <w:sz w:val="18"/>
         </w:rPr>
-        <w:t>Backend: https://pharma-glimmora-ai-backend.onrender.com</w:t>
-        <w:br/>
-        <w:t>Frontend: Pharma Glimmora — GxP Compliance Platform</w:t>
-      </w:r>
-    </w:p>
-    <w:p/>
-    <w:p>
-      <w:r>
-        <w:rPr>
-          <w:b w:val="0"/>
-          <w:i w:val="0"/>
-          <w:sz w:val="22"/>
-        </w:rPr>
-        <w:t>This manual covers every endpoint exposed by the AI backend, where each one surfaces inside the Pharma Glimmora frontend, and sample inputs/outputs. Screenshots show the UI surface for each feature.</w:t>
+        <w:t>v3.0 · 2026-05-04</w:t>
       </w:r>
     </w:p>
     <w:p>
@@ -76,7 +75,7 @@
           <w:i w:val="0"/>
           <w:sz w:val="22"/>
         </w:rPr>
-        <w:t>The AI backend is a FastAPI service that exposes endpoints for authentication, AI-assisted CAPA generation, the full CAPA lifecycle (RCA, Action Plan, Implementation Monitoring, Effectiveness Check, Closure), an audit trail, and a conversational AI assistant with optional voice round-trip.</w:t>
+        <w:t>The Pharma Glimmora AI backend is integrated into the existing compliance platform. This manual walks every AI-powered surface in the order a real QA Head would touch them — sign-in, AI CAPA creation, the 5-stage CAPA lifecycle, the AI assistant chatbot, the audit trail, and the AI Tools diagnostics page.</w:t>
       </w:r>
     </w:p>
     <w:p>
@@ -86,7 +85,7 @@
           <w:i w:val="0"/>
           <w:sz w:val="22"/>
         </w:rPr>
-        <w:t>All protected endpoints require an access token in an `auth` request header. The token is obtained from /api/v1/auth/login and is automatically refreshed by the frontend on every app sign-in — no separate sign-in for the AI features.</w:t>
+        <w:t>All AI traffic is routed through a same-origin proxy at /api/ai-proxy so the browser never sees CORS errors when the Render free-tier dyno cold-starts. There is nothing to configure — just sign in.</w:t>
       </w:r>
     </w:p>
     <w:p>
@@ -97,7 +96,7 @@
         <w:rPr>
           <w:color w:val="302D29"/>
         </w:rPr>
-        <w:t>Endpoint inventory</w:t>
+        <w:t>Test credentials</w:t>
       </w:r>
     </w:p>
     <w:tbl>
@@ -107,14 +106,13 @@
         <w:tblLook w:firstColumn="1" w:firstRow="1" w:lastColumn="0" w:lastRow="0" w:noHBand="0" w:noVBand="1" w:val="04A0"/>
       </w:tblPr>
       <w:tblGrid>
-        <w:gridCol w:w="2880"/>
-        <w:gridCol w:w="2880"/>
-        <w:gridCol w:w="2880"/>
+        <w:gridCol w:w="4320"/>
+        <w:gridCol w:w="4320"/>
       </w:tblGrid>
       <w:tr>
         <w:tc>
           <w:tcPr>
-            <w:tcW w:type="dxa" w:w="2880"/>
+            <w:tcW w:type="dxa" w:w="4320"/>
             <w:shd w:val="clear" w:color="auto" w:fill="FFF7E6"/>
           </w:tcPr>
           <w:p>
@@ -123,13 +121,13 @@
                 <w:b/>
                 <w:color w:val="8B6914"/>
               </w:rPr>
-              <w:t>Endpoint</w:t>
+              <w:t>Field</w:t>
             </w:r>
           </w:p>
         </w:tc>
         <w:tc>
           <w:tcPr>
-            <w:tcW w:type="dxa" w:w="2880"/>
+            <w:tcW w:type="dxa" w:w="4320"/>
             <w:shd w:val="clear" w:color="auto" w:fill="FFF7E6"/>
           </w:tcPr>
           <w:p>
@@ -138,22 +136,7 @@
                 <w:b/>
                 <w:color w:val="8B6914"/>
               </w:rPr>
-              <w:t>Where in app</w:t>
-            </w:r>
-          </w:p>
-        </w:tc>
-        <w:tc>
-          <w:tcPr>
-            <w:tcW w:type="dxa" w:w="2880"/>
-            <w:shd w:val="clear" w:color="auto" w:fill="FFF7E6"/>
-          </w:tcPr>
-          <w:p>
-            <w:r>
-              <w:rPr>
-                <w:b/>
-                <w:color w:val="8B6914"/>
-              </w:rPr>
-              <w:t>Notes</w:t>
+              <w:t>Value</w:t>
             </w:r>
           </w:p>
         </w:tc>
@@ -161,40 +144,27 @@
       <w:tr>
         <w:tc>
           <w:tcPr>
-            <w:tcW w:type="dxa" w:w="2880"/>
+            <w:tcW w:type="dxa" w:w="4320"/>
           </w:tcPr>
           <w:p>
             <w:r>
               <w:rPr>
                 <w:sz w:val="18"/>
               </w:rPr>
-              <w:t>POST /api/v1/auth/login</w:t>
+              <w:t>URL</w:t>
             </w:r>
           </w:p>
         </w:tc>
         <w:tc>
           <w:tcPr>
-            <w:tcW w:type="dxa" w:w="2880"/>
+            <w:tcW w:type="dxa" w:w="4320"/>
           </w:tcPr>
           <w:p>
             <w:r>
               <w:rPr>
                 <w:sz w:val="18"/>
               </w:rPr>
-              <w:t>Every app login (LoginPage refreshAiToken)</w:t>
-            </w:r>
-          </w:p>
-        </w:tc>
-        <w:tc>
-          <w:tcPr>
-            <w:tcW w:type="dxa" w:w="2880"/>
-          </w:tcPr>
-          <w:p>
-            <w:r>
-              <w:rPr>
-                <w:sz w:val="18"/>
-              </w:rPr>
-              <w:t>JSON {username, password} → {access_token, …}</w:t>
+              <w:t>http://localhost:3000</w:t>
             </w:r>
           </w:p>
         </w:tc>
@@ -202,40 +172,27 @@
       <w:tr>
         <w:tc>
           <w:tcPr>
-            <w:tcW w:type="dxa" w:w="2880"/>
+            <w:tcW w:type="dxa" w:w="4320"/>
           </w:tcPr>
           <w:p>
             <w:r>
               <w:rPr>
                 <w:sz w:val="18"/>
               </w:rPr>
-              <w:t>POST /api/v1/auth/signup</w:t>
+              <w:t>Email</w:t>
             </w:r>
           </w:p>
         </w:tc>
         <w:tc>
           <w:tcPr>
-            <w:tcW w:type="dxa" w:w="2880"/>
+            <w:tcW w:type="dxa" w:w="4320"/>
           </w:tcPr>
           <w:p>
             <w:r>
               <w:rPr>
                 <w:sz w:val="18"/>
               </w:rPr>
-              <w:t>Customer admin / tenant user create + login self-heal retry</w:t>
-            </w:r>
-          </w:p>
-        </w:tc>
-        <w:tc>
-          <w:tcPr>
-            <w:tcW w:type="dxa" w:w="2880"/>
-          </w:tcPr>
-          <w:p>
-            <w:r>
-              <w:rPr>
-                <w:sz w:val="18"/>
-              </w:rPr>
-              <w:t>Auto-runs on first login if user not registered yet</w:t>
+              <w:t>qa@pharmaglimmora.com</w:t>
             </w:r>
           </w:p>
         </w:tc>
@@ -243,40 +200,27 @@
       <w:tr>
         <w:tc>
           <w:tcPr>
-            <w:tcW w:type="dxa" w:w="2880"/>
+            <w:tcW w:type="dxa" w:w="4320"/>
           </w:tcPr>
           <w:p>
             <w:r>
               <w:rPr>
                 <w:sz w:val="18"/>
               </w:rPr>
-              <w:t>POST /api/ai/chat</w:t>
+              <w:t>Passcode</w:t>
             </w:r>
           </w:p>
         </w:tc>
         <w:tc>
           <w:tcPr>
-            <w:tcW w:type="dxa" w:w="2880"/>
+            <w:tcW w:type="dxa" w:w="4320"/>
           </w:tcPr>
           <w:p>
             <w:r>
               <w:rPr>
                 <w:sz w:val="18"/>
               </w:rPr>
-              <w:t>Floating chatbot — text mode</w:t>
-            </w:r>
-          </w:p>
-        </w:tc>
-        <w:tc>
-          <w:tcPr>
-            <w:tcW w:type="dxa" w:w="2880"/>
-          </w:tcPr>
-          <w:p>
-            <w:r>
-              <w:rPr>
-                <w:sz w:val="18"/>
-              </w:rPr>
-              <w:t>Threads chat_history; supports follow-up context</w:t>
+              <w:t>QaHead@123</w:t>
             </w:r>
           </w:p>
         </w:tc>
@@ -284,1154 +228,33 @@
       <w:tr>
         <w:tc>
           <w:tcPr>
-            <w:tcW w:type="dxa" w:w="2880"/>
+            <w:tcW w:type="dxa" w:w="4320"/>
           </w:tcPr>
           <w:p>
             <w:r>
               <w:rPr>
                 <w:sz w:val="18"/>
               </w:rPr>
-              <w:t>POST /api/ai/voice/chat</w:t>
+              <w:t>Role</w:t>
             </w:r>
           </w:p>
         </w:tc>
         <w:tc>
           <w:tcPr>
-            <w:tcW w:type="dxa" w:w="2880"/>
+            <w:tcW w:type="dxa" w:w="4320"/>
           </w:tcPr>
           <w:p>
             <w:r>
               <w:rPr>
                 <w:sz w:val="18"/>
               </w:rPr>
-              <w:t>Floating chatbot — round-trip mic</w:t>
-            </w:r>
-          </w:p>
-        </w:tc>
-        <w:tc>
-          <w:tcPr>
-            <w:tcW w:type="dxa" w:w="2880"/>
-          </w:tcPr>
-          <w:p>
-            <w:r>
-              <w:rPr>
-                <w:sz w:val="18"/>
-              </w:rPr>
-              <w:t>audio in → audio reply (Whisper + chat + TTS)</w:t>
-            </w:r>
-          </w:p>
-        </w:tc>
-      </w:tr>
-      <w:tr>
-        <w:tc>
-          <w:tcPr>
-            <w:tcW w:type="dxa" w:w="2880"/>
-          </w:tcPr>
-          <w:p>
-            <w:r>
-              <w:rPr>
-                <w:sz w:val="18"/>
-              </w:rPr>
-              <w:t>POST /api/ai/voice/transcribe</w:t>
-            </w:r>
-          </w:p>
-        </w:tc>
-        <w:tc>
-          <w:tcPr>
-            <w:tcW w:type="dxa" w:w="2880"/>
-          </w:tcPr>
-          <w:p>
-            <w:r>
-              <w:rPr>
-                <w:sz w:val="18"/>
-              </w:rPr>
-              <w:t>Chatbot — Dictate button</w:t>
-            </w:r>
-          </w:p>
-        </w:tc>
-        <w:tc>
-          <w:tcPr>
-            <w:tcW w:type="dxa" w:w="2880"/>
-          </w:tcPr>
-          <w:p>
-            <w:r>
-              <w:rPr>
-                <w:sz w:val="18"/>
-              </w:rPr>
-              <w:t>STT only; transcript drops into the input</w:t>
-            </w:r>
-          </w:p>
-        </w:tc>
-      </w:tr>
-      <w:tr>
-        <w:tc>
-          <w:tcPr>
-            <w:tcW w:type="dxa" w:w="2880"/>
-          </w:tcPr>
-          <w:p>
-            <w:r>
-              <w:rPr>
-                <w:sz w:val="18"/>
-              </w:rPr>
-              <w:t>POST /api/ai/voice/speak</w:t>
-            </w:r>
-          </w:p>
-        </w:tc>
-        <w:tc>
-          <w:tcPr>
-            <w:tcW w:type="dxa" w:w="2880"/>
-          </w:tcPr>
-          <w:p>
-            <w:r>
-              <w:rPr>
-                <w:sz w:val="18"/>
-              </w:rPr>
-              <w:t>Speaker icon on every assistant text bubble</w:t>
-            </w:r>
-          </w:p>
-        </w:tc>
-        <w:tc>
-          <w:tcPr>
-            <w:tcW w:type="dxa" w:w="2880"/>
-          </w:tcPr>
-          <w:p>
-            <w:r>
-              <w:rPr>
-                <w:sz w:val="18"/>
-              </w:rPr>
-              <w:t>TTS only; plays one stored reply on demand</w:t>
-            </w:r>
-          </w:p>
-        </w:tc>
-      </w:tr>
-      <w:tr>
-        <w:tc>
-          <w:tcPr>
-            <w:tcW w:type="dxa" w:w="2880"/>
-          </w:tcPr>
-          <w:p>
-            <w:r>
-              <w:rPr>
-                <w:sz w:val="18"/>
-              </w:rPr>
-              <w:t>POST /api/v1/capa/create</w:t>
-            </w:r>
-          </w:p>
-        </w:tc>
-        <w:tc>
-          <w:tcPr>
-            <w:tcW w:type="dxa" w:w="2880"/>
-          </w:tcPr>
-          <w:p>
-            <w:r>
-              <w:rPr>
-                <w:sz w:val="18"/>
-              </w:rPr>
-              <w:t>AI CAPA modal (CAPA Tracker)</w:t>
-            </w:r>
-          </w:p>
-        </w:tc>
-        <w:tc>
-          <w:tcPr>
-            <w:tcW w:type="dxa" w:w="2880"/>
-          </w:tcPr>
-          <w:p>
-            <w:r>
-              <w:rPr>
-                <w:sz w:val="18"/>
-              </w:rPr>
-              <w:t>Multipart form with optional document; returns risk score + similar CAPAs + recommendation</w:t>
-            </w:r>
-          </w:p>
-        </w:tc>
-      </w:tr>
-      <w:tr>
-        <w:tc>
-          <w:tcPr>
-            <w:tcW w:type="dxa" w:w="2880"/>
-          </w:tcPr>
-          <w:p>
-            <w:r>
-              <w:rPr>
-                <w:sz w:val="18"/>
-              </w:rPr>
-              <w:t>GET /api/v1/capa/all</w:t>
-            </w:r>
-          </w:p>
-        </w:tc>
-        <w:tc>
-          <w:tcPr>
-            <w:tcW w:type="dxa" w:w="2880"/>
-          </w:tcPr>
-          <w:p>
-            <w:r>
-              <w:rPr>
-                <w:sz w:val="18"/>
-              </w:rPr>
-              <w:t>/ai-capa index — super_admin only</w:t>
-            </w:r>
-          </w:p>
-        </w:tc>
-        <w:tc>
-          <w:tcPr>
-            <w:tcW w:type="dxa" w:w="2880"/>
-          </w:tcPr>
-          <w:p>
-            <w:r>
-              <w:rPr>
-                <w:sz w:val="18"/>
-              </w:rPr>
-              <w:t>Returns every CAPA across customers</w:t>
-            </w:r>
-          </w:p>
-        </w:tc>
-      </w:tr>
-      <w:tr>
-        <w:tc>
-          <w:tcPr>
-            <w:tcW w:type="dxa" w:w="2880"/>
-          </w:tcPr>
-          <w:p>
-            <w:r>
-              <w:rPr>
-                <w:sz w:val="18"/>
-              </w:rPr>
-              <w:t>GET /api/v1/capa/customer/{id}</w:t>
-            </w:r>
-          </w:p>
-        </w:tc>
-        <w:tc>
-          <w:tcPr>
-            <w:tcW w:type="dxa" w:w="2880"/>
-          </w:tcPr>
-          <w:p>
-            <w:r>
-              <w:rPr>
-                <w:sz w:val="18"/>
-              </w:rPr>
-              <w:t>/ai-capa index — default scope</w:t>
-            </w:r>
-          </w:p>
-        </w:tc>
-        <w:tc>
-          <w:tcPr>
-            <w:tcW w:type="dxa" w:w="2880"/>
-          </w:tcPr>
-          <w:p>
-            <w:r>
-              <w:rPr>
-                <w:sz w:val="18"/>
-              </w:rPr>
-              <w:t>Customer-scoped CAPA list</w:t>
-            </w:r>
-          </w:p>
-        </w:tc>
-      </w:tr>
-      <w:tr>
-        <w:tc>
-          <w:tcPr>
-            <w:tcW w:type="dxa" w:w="2880"/>
-          </w:tcPr>
-          <w:p>
-            <w:r>
-              <w:rPr>
-                <w:sz w:val="18"/>
-              </w:rPr>
-              <w:t>GET /api/v1/capa/status/{id}</w:t>
-            </w:r>
-          </w:p>
-        </w:tc>
-        <w:tc>
-          <w:tcPr>
-            <w:tcW w:type="dxa" w:w="2880"/>
-          </w:tcPr>
-          <w:p>
-            <w:r>
-              <w:rPr>
-                <w:sz w:val="18"/>
-              </w:rPr>
-              <w:t>/ai-capa/[id] — Summary card</w:t>
-            </w:r>
-          </w:p>
-        </w:tc>
-        <w:tc>
-          <w:tcPr>
-            <w:tcW w:type="dxa" w:w="2880"/>
-          </w:tcPr>
-          <w:p>
-            <w:r>
-              <w:rPr>
-                <w:sz w:val="18"/>
-              </w:rPr>
-              <w:t>Full record by capa_id</w:t>
-            </w:r>
-          </w:p>
-        </w:tc>
-      </w:tr>
-      <w:tr>
-        <w:tc>
-          <w:tcPr>
-            <w:tcW w:type="dxa" w:w="2880"/>
-          </w:tcPr>
-          <w:p>
-            <w:r>
-              <w:rPr>
-                <w:sz w:val="18"/>
-              </w:rPr>
-              <w:t>POST /api/v1/capa/dismiss-alert</w:t>
-            </w:r>
-          </w:p>
-        </w:tc>
-        <w:tc>
-          <w:tcPr>
-            <w:tcW w:type="dxa" w:w="2880"/>
-          </w:tcPr>
-          <w:p>
-            <w:r>
-              <w:rPr>
-                <w:sz w:val="18"/>
-              </w:rPr>
-              <w:t>Recurrence panel inside the AI CAPA result modal</w:t>
-            </w:r>
-          </w:p>
-        </w:tc>
-        <w:tc>
-          <w:tcPr>
-            <w:tcW w:type="dxa" w:w="2880"/>
-          </w:tcPr>
-          <w:p>
-            <w:r>
-              <w:rPr>
-                <w:sz w:val="18"/>
-              </w:rPr>
-              <w:t>Reason ≥ 5 chars + e-signature, immutable in audit trail</w:t>
-            </w:r>
-          </w:p>
-        </w:tc>
-      </w:tr>
-      <w:tr>
-        <w:tc>
-          <w:tcPr>
-            <w:tcW w:type="dxa" w:w="2880"/>
-          </w:tcPr>
-          <w:p>
-            <w:r>
-              <w:rPr>
-                <w:sz w:val="18"/>
-              </w:rPr>
-              <w:t>POST /api/v1/rca/submit</w:t>
-            </w:r>
-          </w:p>
-        </w:tc>
-        <w:tc>
-          <w:tcPr>
-            <w:tcW w:type="dxa" w:w="2880"/>
-          </w:tcPr>
-          <w:p>
-            <w:r>
-              <w:rPr>
-                <w:sz w:val="18"/>
-              </w:rPr>
-              <w:t>RCA modal in lifecycle page</w:t>
-            </w:r>
-          </w:p>
-        </w:tc>
-        <w:tc>
-          <w:tcPr>
-            <w:tcW w:type="dxa" w:w="2880"/>
-          </w:tcPr>
-          <w:p>
-            <w:r>
-              <w:rPr>
-                <w:sz w:val="18"/>
-              </w:rPr>
-              <w:t>Method (5-Why / Fishbone / Fault Tree / Other) + evidence</w:t>
-            </w:r>
-          </w:p>
-        </w:tc>
-      </w:tr>
-      <w:tr>
-        <w:tc>
-          <w:tcPr>
-            <w:tcW w:type="dxa" w:w="2880"/>
-          </w:tcPr>
-          <w:p>
-            <w:r>
-              <w:rPr>
-                <w:sz w:val="18"/>
-              </w:rPr>
-              <w:t>GET /api/v1/rca/capa/{id}</w:t>
-            </w:r>
-          </w:p>
-        </w:tc>
-        <w:tc>
-          <w:tcPr>
-            <w:tcW w:type="dxa" w:w="2880"/>
-          </w:tcPr>
-          <w:p>
-            <w:r>
-              <w:rPr>
-                <w:sz w:val="18"/>
-              </w:rPr>
-              <w:t>RCA section in lifecycle page</w:t>
-            </w:r>
-          </w:p>
-        </w:tc>
-        <w:tc>
-          <w:tcPr>
-            <w:tcW w:type="dxa" w:w="2880"/>
-          </w:tcPr>
-          <w:p>
-            <w:r>
-              <w:rPr>
-                <w:sz w:val="18"/>
-              </w:rPr>
-              <w:t>Auto-loaded; shows RCA records for the CAPA</w:t>
-            </w:r>
-          </w:p>
-        </w:tc>
-      </w:tr>
-      <w:tr>
-        <w:tc>
-          <w:tcPr>
-            <w:tcW w:type="dxa" w:w="2880"/>
-          </w:tcPr>
-          <w:p>
-            <w:r>
-              <w:rPr>
-                <w:sz w:val="18"/>
-              </w:rPr>
-              <w:t>GET /api/v1/rca/status/{id}</w:t>
-            </w:r>
-          </w:p>
-        </w:tc>
-        <w:tc>
-          <w:tcPr>
-            <w:tcW w:type="dxa" w:w="2880"/>
-          </w:tcPr>
-          <w:p>
-            <w:r>
-              <w:rPr>
-                <w:sz w:val="18"/>
-              </w:rPr>
-              <w:t>/ai-tools — RCA status lookup</w:t>
-            </w:r>
-          </w:p>
-        </w:tc>
-        <w:tc>
-          <w:tcPr>
-            <w:tcW w:type="dxa" w:w="2880"/>
-          </w:tcPr>
-          <w:p>
-            <w:r>
-              <w:rPr>
-                <w:sz w:val="18"/>
-              </w:rPr>
-              <w:t>Fetch a single RCA by rca_id</w:t>
-            </w:r>
-          </w:p>
-        </w:tc>
-      </w:tr>
-      <w:tr>
-        <w:tc>
-          <w:tcPr>
-            <w:tcW w:type="dxa" w:w="2880"/>
-          </w:tcPr>
-          <w:p>
-            <w:r>
-              <w:rPr>
-                <w:sz w:val="18"/>
-              </w:rPr>
-              <w:t>POST /api/v1/action-plan/submit</w:t>
-            </w:r>
-          </w:p>
-        </w:tc>
-        <w:tc>
-          <w:tcPr>
-            <w:tcW w:type="dxa" w:w="2880"/>
-          </w:tcPr>
-          <w:p>
-            <w:r>
-              <w:rPr>
-                <w:sz w:val="18"/>
-              </w:rPr>
-              <w:t>Action Plan modal</w:t>
-            </w:r>
-          </w:p>
-        </w:tc>
-        <w:tc>
-          <w:tcPr>
-            <w:tcW w:type="dxa" w:w="2880"/>
-          </w:tcPr>
-          <w:p>
-            <w:r>
-              <w:rPr>
-                <w:sz w:val="18"/>
-              </w:rPr>
-              <w:t>Multi-row action editor (description / responsible / due date)</w:t>
-            </w:r>
-          </w:p>
-        </w:tc>
-      </w:tr>
-      <w:tr>
-        <w:tc>
-          <w:tcPr>
-            <w:tcW w:type="dxa" w:w="2880"/>
-          </w:tcPr>
-          <w:p>
-            <w:r>
-              <w:rPr>
-                <w:sz w:val="18"/>
-              </w:rPr>
-              <w:t>GET /api/v1/action-plan/capa/{id}</w:t>
-            </w:r>
-          </w:p>
-        </w:tc>
-        <w:tc>
-          <w:tcPr>
-            <w:tcW w:type="dxa" w:w="2880"/>
-          </w:tcPr>
-          <w:p>
-            <w:r>
-              <w:rPr>
-                <w:sz w:val="18"/>
-              </w:rPr>
-              <w:t>Action Plan section in lifecycle page</w:t>
-            </w:r>
-          </w:p>
-        </w:tc>
-        <w:tc>
-          <w:tcPr>
-            <w:tcW w:type="dxa" w:w="2880"/>
-          </w:tcPr>
-          <w:p>
-            <w:r>
-              <w:rPr>
-                <w:sz w:val="18"/>
-              </w:rPr>
-              <w:t>Auto-loaded</w:t>
-            </w:r>
-          </w:p>
-        </w:tc>
-      </w:tr>
-      <w:tr>
-        <w:tc>
-          <w:tcPr>
-            <w:tcW w:type="dxa" w:w="2880"/>
-          </w:tcPr>
-          <w:p>
-            <w:r>
-              <w:rPr>
-                <w:sz w:val="18"/>
-              </w:rPr>
-              <w:t>GET /api/v1/action-plan/status/{id}</w:t>
-            </w:r>
-          </w:p>
-        </w:tc>
-        <w:tc>
-          <w:tcPr>
-            <w:tcW w:type="dxa" w:w="2880"/>
-          </w:tcPr>
-          <w:p>
-            <w:r>
-              <w:rPr>
-                <w:sz w:val="18"/>
-              </w:rPr>
-              <w:t>/ai-tools — Action plan status lookup</w:t>
-            </w:r>
-          </w:p>
-        </w:tc>
-        <w:tc>
-          <w:tcPr>
-            <w:tcW w:type="dxa" w:w="2880"/>
-          </w:tcPr>
-          <w:p>
-            <w:r>
-              <w:rPr>
-                <w:sz w:val="18"/>
-              </w:rPr>
-              <w:t>Fetch a single plan by action_plan_id</w:t>
-            </w:r>
-          </w:p>
-        </w:tc>
-      </w:tr>
-      <w:tr>
-        <w:tc>
-          <w:tcPr>
-            <w:tcW w:type="dxa" w:w="2880"/>
-          </w:tcPr>
-          <w:p>
-            <w:r>
-              <w:rPr>
-                <w:sz w:val="18"/>
-              </w:rPr>
-              <w:t>POST /api/v1/monitoring/check</w:t>
-            </w:r>
-          </w:p>
-        </w:tc>
-        <w:tc>
-          <w:tcPr>
-            <w:tcW w:type="dxa" w:w="2880"/>
-          </w:tcPr>
-          <w:p>
-            <w:r>
-              <w:rPr>
-                <w:sz w:val="18"/>
-              </w:rPr>
-              <w:t>Monitoring modal</w:t>
-            </w:r>
-          </w:p>
-        </w:tc>
-        <w:tc>
-          <w:tcPr>
-            <w:tcW w:type="dxa" w:w="2880"/>
-          </w:tcPr>
-          <w:p>
-            <w:r>
-              <w:rPr>
-                <w:sz w:val="18"/>
-              </w:rPr>
-              <w:t>Per-action status (On Track / Delayed / …) + progress notes</w:t>
-            </w:r>
-          </w:p>
-        </w:tc>
-      </w:tr>
-      <w:tr>
-        <w:tc>
-          <w:tcPr>
-            <w:tcW w:type="dxa" w:w="2880"/>
-          </w:tcPr>
-          <w:p>
-            <w:r>
-              <w:rPr>
-                <w:sz w:val="18"/>
-              </w:rPr>
-              <w:t>GET /api/v1/monitoring/capa/{id}</w:t>
-            </w:r>
-          </w:p>
-        </w:tc>
-        <w:tc>
-          <w:tcPr>
-            <w:tcW w:type="dxa" w:w="2880"/>
-          </w:tcPr>
-          <w:p>
-            <w:r>
-              <w:rPr>
-                <w:sz w:val="18"/>
-              </w:rPr>
-              <w:t>Monitoring section in lifecycle page</w:t>
-            </w:r>
-          </w:p>
-        </w:tc>
-        <w:tc>
-          <w:tcPr>
-            <w:tcW w:type="dxa" w:w="2880"/>
-          </w:tcPr>
-          <w:p>
-            <w:r>
-              <w:rPr>
-                <w:sz w:val="18"/>
-              </w:rPr>
-              <w:t>Auto-loaded</w:t>
-            </w:r>
-          </w:p>
-        </w:tc>
-      </w:tr>
-      <w:tr>
-        <w:tc>
-          <w:tcPr>
-            <w:tcW w:type="dxa" w:w="2880"/>
-          </w:tcPr>
-          <w:p>
-            <w:r>
-              <w:rPr>
-                <w:sz w:val="18"/>
-              </w:rPr>
-              <w:t>GET /api/v1/monitoring/status/{id}</w:t>
-            </w:r>
-          </w:p>
-        </w:tc>
-        <w:tc>
-          <w:tcPr>
-            <w:tcW w:type="dxa" w:w="2880"/>
-          </w:tcPr>
-          <w:p>
-            <w:r>
-              <w:rPr>
-                <w:sz w:val="18"/>
-              </w:rPr>
-              <w:t>/ai-tools — Monitoring status lookup</w:t>
-            </w:r>
-          </w:p>
-        </w:tc>
-        <w:tc>
-          <w:tcPr>
-            <w:tcW w:type="dxa" w:w="2880"/>
-          </w:tcPr>
-          <w:p>
-            <w:r>
-              <w:rPr>
-                <w:sz w:val="18"/>
-              </w:rPr>
-            </w:r>
-          </w:p>
-        </w:tc>
-      </w:tr>
-      <w:tr>
-        <w:tc>
-          <w:tcPr>
-            <w:tcW w:type="dxa" w:w="2880"/>
-          </w:tcPr>
-          <w:p>
-            <w:r>
-              <w:rPr>
-                <w:sz w:val="18"/>
-              </w:rPr>
-              <w:t>POST /api/v1/effectiveness/check</w:t>
-            </w:r>
-          </w:p>
-        </w:tc>
-        <w:tc>
-          <w:tcPr>
-            <w:tcW w:type="dxa" w:w="2880"/>
-          </w:tcPr>
-          <w:p>
-            <w:r>
-              <w:rPr>
-                <w:sz w:val="18"/>
-              </w:rPr>
-              <w:t>Effectiveness modal</w:t>
-            </w:r>
-          </w:p>
-        </w:tc>
-        <w:tc>
-          <w:tcPr>
-            <w:tcW w:type="dxa" w:w="2880"/>
-          </w:tcPr>
-          <w:p>
-            <w:r>
-              <w:rPr>
-                <w:sz w:val="18"/>
-              </w:rPr>
-              <w:t>Days since CAPA, evidence items, trend metrics, new-issues flag</w:t>
-            </w:r>
-          </w:p>
-        </w:tc>
-      </w:tr>
-      <w:tr>
-        <w:tc>
-          <w:tcPr>
-            <w:tcW w:type="dxa" w:w="2880"/>
-          </w:tcPr>
-          <w:p>
-            <w:r>
-              <w:rPr>
-                <w:sz w:val="18"/>
-              </w:rPr>
-              <w:t>GET /api/v1/effectiveness/capa/{id}</w:t>
-            </w:r>
-          </w:p>
-        </w:tc>
-        <w:tc>
-          <w:tcPr>
-            <w:tcW w:type="dxa" w:w="2880"/>
-          </w:tcPr>
-          <w:p>
-            <w:r>
-              <w:rPr>
-                <w:sz w:val="18"/>
-              </w:rPr>
-              <w:t>Effectiveness section in lifecycle page</w:t>
-            </w:r>
-          </w:p>
-        </w:tc>
-        <w:tc>
-          <w:tcPr>
-            <w:tcW w:type="dxa" w:w="2880"/>
-          </w:tcPr>
-          <w:p>
-            <w:r>
-              <w:rPr>
-                <w:sz w:val="18"/>
-              </w:rPr>
-              <w:t>Auto-loaded</w:t>
-            </w:r>
-          </w:p>
-        </w:tc>
-      </w:tr>
-      <w:tr>
-        <w:tc>
-          <w:tcPr>
-            <w:tcW w:type="dxa" w:w="2880"/>
-          </w:tcPr>
-          <w:p>
-            <w:r>
-              <w:rPr>
-                <w:sz w:val="18"/>
-              </w:rPr>
-              <w:t>GET /api/v1/effectiveness/status/{id}</w:t>
-            </w:r>
-          </w:p>
-        </w:tc>
-        <w:tc>
-          <w:tcPr>
-            <w:tcW w:type="dxa" w:w="2880"/>
-          </w:tcPr>
-          <w:p>
-            <w:r>
-              <w:rPr>
-                <w:sz w:val="18"/>
-              </w:rPr>
-              <w:t>/ai-tools — Effectiveness status lookup</w:t>
-            </w:r>
-          </w:p>
-        </w:tc>
-        <w:tc>
-          <w:tcPr>
-            <w:tcW w:type="dxa" w:w="2880"/>
-          </w:tcPr>
-          <w:p>
-            <w:r>
-              <w:rPr>
-                <w:sz w:val="18"/>
-              </w:rPr>
-            </w:r>
-          </w:p>
-        </w:tc>
-      </w:tr>
-      <w:tr>
-        <w:tc>
-          <w:tcPr>
-            <w:tcW w:type="dxa" w:w="2880"/>
-          </w:tcPr>
-          <w:p>
-            <w:r>
-              <w:rPr>
-                <w:sz w:val="18"/>
-              </w:rPr>
-              <w:t>POST /api/v1/closure/initiate</w:t>
-            </w:r>
-          </w:p>
-        </w:tc>
-        <w:tc>
-          <w:tcPr>
-            <w:tcW w:type="dxa" w:w="2880"/>
-          </w:tcPr>
-          <w:p>
-            <w:r>
-              <w:rPr>
-                <w:sz w:val="18"/>
-              </w:rPr>
-              <w:t>Closure modal</w:t>
-            </w:r>
-          </w:p>
-        </w:tc>
-        <w:tc>
-          <w:tcPr>
-            <w:tcW w:type="dxa" w:w="2880"/>
-          </w:tcPr>
-          <w:p>
-            <w:r>
-              <w:rPr>
-                <w:sz w:val="18"/>
-              </w:rPr>
-              <w:t>21 CFR Part 11: approver, designation, e-signature, rationale</w:t>
-            </w:r>
-          </w:p>
-        </w:tc>
-      </w:tr>
-      <w:tr>
-        <w:tc>
-          <w:tcPr>
-            <w:tcW w:type="dxa" w:w="2880"/>
-          </w:tcPr>
-          <w:p>
-            <w:r>
-              <w:rPr>
-                <w:sz w:val="18"/>
-              </w:rPr>
-              <w:t>GET /api/v1/closure/capa/{id}</w:t>
-            </w:r>
-          </w:p>
-        </w:tc>
-        <w:tc>
-          <w:tcPr>
-            <w:tcW w:type="dxa" w:w="2880"/>
-          </w:tcPr>
-          <w:p>
-            <w:r>
-              <w:rPr>
-                <w:sz w:val="18"/>
-              </w:rPr>
-              <w:t>Closure section in lifecycle page</w:t>
-            </w:r>
-          </w:p>
-        </w:tc>
-        <w:tc>
-          <w:tcPr>
-            <w:tcW w:type="dxa" w:w="2880"/>
-          </w:tcPr>
-          <w:p>
-            <w:r>
-              <w:rPr>
-                <w:sz w:val="18"/>
-              </w:rPr>
-              <w:t>Auto-loaded</w:t>
-            </w:r>
-          </w:p>
-        </w:tc>
-      </w:tr>
-      <w:tr>
-        <w:tc>
-          <w:tcPr>
-            <w:tcW w:type="dxa" w:w="2880"/>
-          </w:tcPr>
-          <w:p>
-            <w:r>
-              <w:rPr>
-                <w:sz w:val="18"/>
-              </w:rPr>
-              <w:t>GET /api/v1/closure/status/{id}</w:t>
-            </w:r>
-          </w:p>
-        </w:tc>
-        <w:tc>
-          <w:tcPr>
-            <w:tcW w:type="dxa" w:w="2880"/>
-          </w:tcPr>
-          <w:p>
-            <w:r>
-              <w:rPr>
-                <w:sz w:val="18"/>
-              </w:rPr>
-              <w:t>/ai-tools — Closure status lookup</w:t>
-            </w:r>
-          </w:p>
-        </w:tc>
-        <w:tc>
-          <w:tcPr>
-            <w:tcW w:type="dxa" w:w="2880"/>
-          </w:tcPr>
-          <w:p>
-            <w:r>
-              <w:rPr>
-                <w:sz w:val="18"/>
-              </w:rPr>
-            </w:r>
-          </w:p>
-        </w:tc>
-      </w:tr>
-      <w:tr>
-        <w:tc>
-          <w:tcPr>
-            <w:tcW w:type="dxa" w:w="2880"/>
-          </w:tcPr>
-          <w:p>
-            <w:r>
-              <w:rPr>
-                <w:sz w:val="18"/>
-              </w:rPr>
-              <w:t>GET /api/v1/audit/all</w:t>
-            </w:r>
-          </w:p>
-        </w:tc>
-        <w:tc>
-          <w:tcPr>
-            <w:tcW w:type="dxa" w:w="2880"/>
-          </w:tcPr>
-          <w:p>
-            <w:r>
-              <w:rPr>
-                <w:sz w:val="18"/>
-              </w:rPr>
-              <w:t>Audit Trail page → AI Backend tab</w:t>
-            </w:r>
-          </w:p>
-        </w:tc>
-        <w:tc>
-          <w:tcPr>
-            <w:tcW w:type="dxa" w:w="2880"/>
-          </w:tcPr>
-          <w:p>
-            <w:r>
-              <w:rPr>
-                <w:sz w:val="18"/>
-              </w:rPr>
-              <w:t>Returns the full backend audit log</w:t>
-            </w:r>
-          </w:p>
-        </w:tc>
-      </w:tr>
-      <w:tr>
-        <w:tc>
-          <w:tcPr>
-            <w:tcW w:type="dxa" w:w="2880"/>
-          </w:tcPr>
-          <w:p>
-            <w:r>
-              <w:rPr>
-                <w:sz w:val="18"/>
-              </w:rPr>
-              <w:t>GET /api/v1/audit/record/{id}</w:t>
-            </w:r>
-          </w:p>
-        </w:tc>
-        <w:tc>
-          <w:tcPr>
-            <w:tcW w:type="dxa" w:w="2880"/>
-          </w:tcPr>
-          <w:p>
-            <w:r>
-              <w:rPr>
-                <w:sz w:val="18"/>
-              </w:rPr>
-              <w:t>/ai-tools — Audit record lookup</w:t>
-            </w:r>
-          </w:p>
-        </w:tc>
-        <w:tc>
-          <w:tcPr>
-            <w:tcW w:type="dxa" w:w="2880"/>
-          </w:tcPr>
-          <w:p>
-            <w:r>
-              <w:rPr>
-                <w:sz w:val="18"/>
-              </w:rPr>
-              <w:t>Fetch one audit entry by audit_id</w:t>
-            </w:r>
-          </w:p>
-        </w:tc>
-      </w:tr>
-      <w:tr>
-        <w:tc>
-          <w:tcPr>
-            <w:tcW w:type="dxa" w:w="2880"/>
-          </w:tcPr>
-          <w:p>
-            <w:r>
-              <w:rPr>
-                <w:sz w:val="18"/>
-              </w:rPr>
-              <w:t>GET /api/v1/users/</w:t>
-            </w:r>
-          </w:p>
-        </w:tc>
-        <w:tc>
-          <w:tcPr>
-            <w:tcW w:type="dxa" w:w="2880"/>
-          </w:tcPr>
-          <w:p>
-            <w:r>
-              <w:rPr>
-                <w:sz w:val="18"/>
-              </w:rPr>
-              <w:t>/ai-tools — Users endpoint diagnostic</w:t>
-            </w:r>
-          </w:p>
-        </w:tc>
-        <w:tc>
-          <w:tcPr>
-            <w:tcW w:type="dxa" w:w="2880"/>
-          </w:tcPr>
-          <w:p>
-            <w:r>
-              <w:rPr>
-                <w:sz w:val="18"/>
-              </w:rPr>
-              <w:t>Returns 'Users endpoint working ✅'</w:t>
-            </w:r>
-          </w:p>
-        </w:tc>
-      </w:tr>
-      <w:tr>
-        <w:tc>
-          <w:tcPr>
-            <w:tcW w:type="dxa" w:w="2880"/>
-          </w:tcPr>
-          <w:p>
-            <w:r>
-              <w:rPr>
-                <w:sz w:val="18"/>
-              </w:rPr>
-              <w:t>GET /api/ai/health</w:t>
-            </w:r>
-          </w:p>
-        </w:tc>
-        <w:tc>
-          <w:tcPr>
-            <w:tcW w:type="dxa" w:w="2880"/>
-          </w:tcPr>
-          <w:p>
-            <w:r>
-              <w:rPr>
-                <w:sz w:val="18"/>
-              </w:rPr>
-              <w:t>/ai-tools — AI Assistant health</w:t>
-            </w:r>
-          </w:p>
-        </w:tc>
-        <w:tc>
-          <w:tcPr>
-            <w:tcW w:type="dxa" w:w="2880"/>
-          </w:tcPr>
-          <w:p>
-            <w:r>
-              <w:rPr>
-                <w:sz w:val="18"/>
-              </w:rPr>
-              <w:t>Returns service status</w:t>
-            </w:r>
-          </w:p>
-        </w:tc>
-      </w:tr>
-      <w:tr>
-        <w:tc>
-          <w:tcPr>
-            <w:tcW w:type="dxa" w:w="2880"/>
-          </w:tcPr>
-          <w:p>
-            <w:r>
-              <w:rPr>
-                <w:sz w:val="18"/>
-              </w:rPr>
-              <w:t>GET /api/ai/voice/health</w:t>
-            </w:r>
-          </w:p>
-        </w:tc>
-        <w:tc>
-          <w:tcPr>
-            <w:tcW w:type="dxa" w:w="2880"/>
-          </w:tcPr>
-          <w:p>
-            <w:r>
-              <w:rPr>
-                <w:sz w:val="18"/>
-              </w:rPr>
-              <w:t>/ai-tools — AI Voice health</w:t>
-            </w:r>
-          </w:p>
-        </w:tc>
-        <w:tc>
-          <w:tcPr>
-            <w:tcW w:type="dxa" w:w="2880"/>
-          </w:tcPr>
-          <w:p>
-            <w:r>
-              <w:rPr>
-                <w:sz w:val="18"/>
-              </w:rPr>
-              <w:t>Returns voice status + supported voices</w:t>
+              <w:t>QA Head (covers most lifecycle steps)</w:t>
             </w:r>
           </w:p>
         </w:tc>
       </w:tr>
     </w:tbl>
-    <w:p>
-      <w:r>
-        <w:br w:type="page"/>
-      </w:r>
-    </w:p>
+    <w:p/>
     <w:p>
       <w:pPr>
         <w:pStyle w:val="Heading1"/>
@@ -1444,13 +267,84 @@
       </w:r>
     </w:p>
     <w:p>
+      <w:pPr>
+        <w:ind w:left="227"/>
+      </w:pPr>
       <w:r>
         <w:rPr>
-          <w:b w:val="0"/>
-          <w:i w:val="0"/>
+          <w:b/>
+          <w:color w:val="8B6914"/>
           <w:sz w:val="22"/>
         </w:rPr>
-        <w:t>The login page accepts both usernames and email addresses. On success, the frontend silently calls /api/v1/auth/login on the AI backend and stores the returned access_token on the user record. If the user isn't registered on the AI backend yet, the frontend auto-runs /api/v1/auth/signup with the credentials you typed — no manual provisioning step is required.</w:t>
+        <w:t xml:space="preserve">1. </w:t>
+      </w:r>
+      <w:r>
+        <w:rPr>
+          <w:b/>
+          <w:sz w:val="22"/>
+        </w:rPr>
+        <w:t>Open the app</w:t>
+      </w:r>
+      <w:r>
+        <w:rPr>
+          <w:color w:val="64748B"/>
+          <w:sz w:val="20"/>
+        </w:rPr>
+        <w:t xml:space="preserve">  Visit http://localhost:3000 — the login page loads.</w:t>
+      </w:r>
+    </w:p>
+    <w:p>
+      <w:pPr>
+        <w:ind w:left="227"/>
+      </w:pPr>
+      <w:r>
+        <w:rPr>
+          <w:b/>
+          <w:color w:val="8B6914"/>
+          <w:sz w:val="22"/>
+        </w:rPr>
+        <w:t xml:space="preserve">2. </w:t>
+      </w:r>
+      <w:r>
+        <w:rPr>
+          <w:b/>
+          <w:sz w:val="22"/>
+        </w:rPr>
+        <w:t>Enter the QA credentials</w:t>
+      </w:r>
+      <w:r>
+        <w:rPr>
+          <w:color w:val="64748B"/>
+          <w:sz w:val="20"/>
+        </w:rPr>
+        <w:t xml:space="preserve">  Email qa@pharmaglimmora.com, Passcode QaHead@123, then click Sign in.</w:t>
+      </w:r>
+    </w:p>
+    <w:p>
+      <w:pPr>
+        <w:ind w:left="227"/>
+      </w:pPr>
+      <w:r>
+        <w:rPr>
+          <w:b/>
+          <w:color w:val="8B6914"/>
+          <w:sz w:val="22"/>
+        </w:rPr>
+        <w:t xml:space="preserve">3. </w:t>
+      </w:r>
+      <w:r>
+        <w:rPr>
+          <w:b/>
+          <w:sz w:val="22"/>
+        </w:rPr>
+        <w:t>Wait for redirect</w:t>
+      </w:r>
+      <w:r>
+        <w:rPr>
+          <w:color w:val="64748B"/>
+          <w:sz w:val="20"/>
+        </w:rPr>
+        <w:t xml:space="preserve">  On success you land on the Executive Dashboard. AI access token is fetched automatically.</w:t>
       </w:r>
     </w:p>
     <w:p>
@@ -1460,7 +354,7 @@
       <w:r>
         <w:drawing>
           <wp:inline xmlns:a="http://schemas.openxmlformats.org/drawingml/2006/main" xmlns:pic="http://schemas.openxmlformats.org/drawingml/2006/picture">
-            <wp:extent cx="5943600" cy="3807619"/>
+            <wp:extent cx="5486400" cy="5131006"/>
             <wp:docPr id="1" name="Picture 1"/>
             <wp:cNvGraphicFramePr>
               <a:graphicFrameLocks noChangeAspect="1"/>
@@ -1481,7 +375,7 @@
                   <pic:spPr>
                     <a:xfrm>
                       <a:off x="0" y="0"/>
-                      <a:ext cx="5943600" cy="3807619"/>
+                      <a:ext cx="5486400" cy="5131006"/>
                     </a:xfrm>
                     <a:prstGeom prst="rect"/>
                   </pic:spPr>
@@ -1507,76 +401,29 @@
     </w:p>
     <w:p>
       <w:pPr>
-        <w:pStyle w:val="Heading3"/>
+        <w:pStyle w:val="ListBullet"/>
       </w:pPr>
       <w:r>
         <w:rPr>
-          <w:color w:val="302D29"/>
+          <w:color w:val="10B981"/>
+          <w:sz w:val="20"/>
         </w:rPr>
-        <w:t>Sample login response</w:t>
+        <w:t>✓  Top-right shows 'Dr. Priya Sharma · QA Head'.</w:t>
       </w:r>
     </w:p>
     <w:p>
       <w:pPr>
-        <w:spacing w:after="120"/>
-        <w:ind w:left="283"/>
+        <w:pStyle w:val="ListBullet"/>
       </w:pPr>
       <w:r>
         <w:rPr>
-          <w:rFonts w:ascii="Consolas" w:hAnsi="Consolas"/>
-          <w:sz w:val="18"/>
-          <w:rFonts w:ascii="Consolas" w:hAnsi="Consolas"/>
+          <w:color w:val="10B981"/>
+          <w:sz w:val="20"/>
         </w:rPr>
-        <w:t>POST /api/v1/auth/login</w:t>
-        <w:br/>
-        <w:t>{"username":"qa@pharmaglimmora.com","password":"QaHead@123"}</w:t>
-        <w:br/>
-        <w:br/>
-        <w:t>200 OK</w:t>
-        <w:br/>
-        <w:t>{</w:t>
-        <w:br/>
-        <w:t xml:space="preserve">  "access_token": "eyJhbGciOiJIUzI1NiIs…",</w:t>
-        <w:br/>
-        <w:t xml:space="preserve">  "token_type": "Bearer",</w:t>
-        <w:br/>
-        <w:t xml:space="preserve">  "username": "qa@pharmaglimmora.com",</w:t>
-        <w:br/>
-        <w:t xml:space="preserve">  "customer_id": "CUST_TEST01",</w:t>
-        <w:br/>
-        <w:t xml:space="preserve">  "role": "qa_head",</w:t>
-        <w:br/>
-        <w:t xml:space="preserve">  "message": "✅ Login successful. Welcome qa@pharmaglimmora.com!"</w:t>
-        <w:br/>
-        <w:t>}</w:t>
+        <w:t>✓  No red errors in the browser console (F12 → Console).</w:t>
       </w:r>
     </w:p>
-    <w:p>
-      <w:r>
-        <w:br w:type="page"/>
-      </w:r>
-    </w:p>
-    <w:p>
-      <w:pPr>
-        <w:pStyle w:val="Heading1"/>
-      </w:pPr>
-      <w:r>
-        <w:rPr>
-          <w:color w:val="302D29"/>
-        </w:rPr>
-        <w:t>3. AI-Generated CAPA</w:t>
-      </w:r>
-    </w:p>
-    <w:p>
-      <w:r>
-        <w:rPr>
-          <w:b w:val="0"/>
-          <w:i w:val="0"/>
-          <w:sz w:val="22"/>
-        </w:rPr>
-        <w:t>On the CAPA Tracker page, click the AI CAPA button (next to New CAPA) to open the AI-Generated CAPA modal. Customer ID is auto-populated from your tenant's customer admin and is no longer shown in the form.</w:t>
-      </w:r>
-    </w:p>
+    <w:p/>
     <w:p>
       <w:pPr>
         <w:jc w:val="center"/>
@@ -1584,7 +431,7 @@
       <w:r>
         <w:drawing>
           <wp:inline xmlns:a="http://schemas.openxmlformats.org/drawingml/2006/main" xmlns:pic="http://schemas.openxmlformats.org/drawingml/2006/picture">
-            <wp:extent cx="5943600" cy="3807619"/>
+            <wp:extent cx="5486400" cy="4035206"/>
             <wp:docPr id="2" name="Picture 2"/>
             <wp:cNvGraphicFramePr>
               <a:graphicFrameLocks noChangeAspect="1"/>
@@ -1593,7 +440,7 @@
               <a:graphicData uri="http://schemas.openxmlformats.org/drawingml/2006/picture">
                 <pic:pic>
                   <pic:nvPicPr>
-                    <pic:cNvPr id="0" name="03-capa-tracker.png"/>
+                    <pic:cNvPr id="0" name="02-dashboard.png"/>
                     <pic:cNvPicPr/>
                   </pic:nvPicPr>
                   <pic:blipFill>
@@ -1605,7 +452,7 @@
                   <pic:spPr>
                     <a:xfrm>
                       <a:off x="0" y="0"/>
-                      <a:ext cx="5943600" cy="3807619"/>
+                      <a:ext cx="5486400" cy="4035206"/>
                     </a:xfrm>
                     <a:prstGeom prst="rect"/>
                   </pic:spPr>
@@ -1626,7 +473,98 @@
           <w:color w:val="64748B"/>
           <w:sz w:val="18"/>
         </w:rPr>
-        <w:t>Figure — CAPA Tracker — AI CAPA + New CAPA buttons</w:t>
+        <w:t>Figure — Executive Dashboard after sign-in</w:t>
+      </w:r>
+    </w:p>
+    <w:p>
+      <w:r>
+        <w:br w:type="page"/>
+      </w:r>
+    </w:p>
+    <w:p>
+      <w:pPr>
+        <w:pStyle w:val="Heading1"/>
+      </w:pPr>
+      <w:r>
+        <w:rPr>
+          <w:color w:val="302D29"/>
+        </w:rPr>
+        <w:t>3. AI-generated CAPA</w:t>
+      </w:r>
+    </w:p>
+    <w:p>
+      <w:r>
+        <w:rPr>
+          <w:b w:val="0"/>
+          <w:i w:val="0"/>
+          <w:sz w:val="22"/>
+        </w:rPr>
+        <w:t>The AI CAPA flow analyses your problem statement against historical CAPAs, detects recurrence patterns, and proposes a recommendation. It also flags risk score and (when applicable) a recurrence alert that requires an electronic-signature dismissal.</w:t>
+      </w:r>
+    </w:p>
+    <w:p>
+      <w:pPr>
+        <w:pStyle w:val="Heading2"/>
+      </w:pPr>
+      <w:r>
+        <w:rPr>
+          <w:color w:val="302D29"/>
+        </w:rPr>
+        <w:t>3.1  Open the CAPA Tracker</w:t>
+      </w:r>
+    </w:p>
+    <w:p>
+      <w:pPr>
+        <w:ind w:left="227"/>
+      </w:pPr>
+      <w:r>
+        <w:rPr>
+          <w:b/>
+          <w:color w:val="8B6914"/>
+          <w:sz w:val="22"/>
+        </w:rPr>
+        <w:t xml:space="preserve">1. </w:t>
+      </w:r>
+      <w:r>
+        <w:rPr>
+          <w:b/>
+          <w:sz w:val="22"/>
+        </w:rPr>
+        <w:t>Navigate to /capa</w:t>
+      </w:r>
+      <w:r>
+        <w:rPr>
+          <w:color w:val="64748B"/>
+          <w:sz w:val="20"/>
+        </w:rPr>
+        <w:t xml:space="preserve">  Sidebar → Core Compliance → CAPA Tracker.</w:t>
+      </w:r>
+    </w:p>
+    <w:p>
+      <w:pPr>
+        <w:ind w:left="227"/>
+      </w:pPr>
+      <w:r>
+        <w:rPr>
+          <w:b/>
+          <w:color w:val="8B6914"/>
+          <w:sz w:val="22"/>
+        </w:rPr>
+        <w:t xml:space="preserve">2. </w:t>
+      </w:r>
+      <w:r>
+        <w:rPr>
+          <w:b/>
+          <w:sz w:val="22"/>
+        </w:rPr>
+        <w:t>Switch to the CAPA Tracker tab</w:t>
+      </w:r>
+      <w:r>
+        <w:rPr>
+          <w:color w:val="64748B"/>
+          <w:sz w:val="20"/>
+        </w:rPr>
+        <w:t xml:space="preserve">  Top tab strip on the page.</w:t>
       </w:r>
     </w:p>
     <w:p>
@@ -1636,7 +574,7 @@
       <w:r>
         <w:drawing>
           <wp:inline xmlns:a="http://schemas.openxmlformats.org/drawingml/2006/main" xmlns:pic="http://schemas.openxmlformats.org/drawingml/2006/picture">
-            <wp:extent cx="5943600" cy="3807619"/>
+            <wp:extent cx="5486400" cy="2943000"/>
             <wp:docPr id="3" name="Picture 3"/>
             <wp:cNvGraphicFramePr>
               <a:graphicFrameLocks noChangeAspect="1"/>
@@ -1645,7 +583,7 @@
               <a:graphicData uri="http://schemas.openxmlformats.org/drawingml/2006/picture">
                 <pic:pic>
                   <pic:nvPicPr>
-                    <pic:cNvPr id="0" name="04-ai-capa-modal.png"/>
+                    <pic:cNvPr id="0" name="03-capa-tracker.png"/>
                     <pic:cNvPicPr/>
                   </pic:nvPicPr>
                   <pic:blipFill>
@@ -1657,7 +595,7 @@
                   <pic:spPr>
                     <a:xfrm>
                       <a:off x="0" y="0"/>
-                      <a:ext cx="5943600" cy="3807619"/>
+                      <a:ext cx="5486400" cy="2943000"/>
                     </a:xfrm>
                     <a:prstGeom prst="rect"/>
                   </pic:spPr>
@@ -1678,266 +616,302 @@
           <w:color w:val="64748B"/>
           <w:sz w:val="18"/>
         </w:rPr>
-        <w:t>Figure — AI-Generated CAPA modal</w:t>
+        <w:t>Figure — CAPA Tracker tab — AI CAPA button is in the toolbar</w:t>
       </w:r>
     </w:p>
     <w:p>
       <w:pPr>
-        <w:pStyle w:val="Heading3"/>
+        <w:pStyle w:val="Heading2"/>
       </w:pPr>
       <w:r>
         <w:rPr>
           <w:color w:val="302D29"/>
         </w:rPr>
-        <w:t>Sample input (multipart/form-data)</w:t>
+        <w:t>3.2  Generate an AI CAPA</w:t>
       </w:r>
     </w:p>
     <w:p>
       <w:pPr>
-        <w:spacing w:after="120"/>
-        <w:ind w:left="283"/>
+        <w:ind w:left="227"/>
       </w:pPr>
       <w:r>
         <w:rPr>
-          <w:rFonts w:ascii="Consolas" w:hAnsi="Consolas"/>
-          <w:sz w:val="18"/>
-          <w:rFonts w:ascii="Consolas" w:hAnsi="Consolas"/>
+          <w:b/>
+          <w:color w:val="8B6914"/>
+          <w:sz w:val="22"/>
         </w:rPr>
-        <w:t>POST /api/v1/capa/create</w:t>
-        <w:br/>
-        <w:t>Headers: auth: &lt;access_token&gt;</w:t>
-        <w:br/>
-        <w:br/>
-        <w:t xml:space="preserve">  customer_id      = CUST_001</w:t>
-        <w:br/>
-        <w:t xml:space="preserve">  problem_statement = Coating defects observed on tablet batch</w:t>
-        <w:br/>
-        <w:t xml:space="preserve">                      BX-2026-088 — inconsistent film thickness</w:t>
-        <w:br/>
-        <w:t xml:space="preserve">                      on ~12% of units.</w:t>
-        <w:br/>
-        <w:t xml:space="preserve">  source           = Deviation</w:t>
-        <w:br/>
-        <w:t xml:space="preserve">  area_affected    = Manufacturing - Coating Suite 2</w:t>
-        <w:br/>
-        <w:t xml:space="preserve">  equipment_product = Coater (GLATT GC-1000)</w:t>
-        <w:br/>
-        <w:t xml:space="preserve">  initial_severity = High</w:t>
-        <w:br/>
-        <w:t xml:space="preserve">  document         = (optional file upload)</w:t>
-        <w:br/>
+        <w:t xml:space="preserve">1. </w:t>
+      </w:r>
+      <w:r>
+        <w:rPr>
+          <w:b/>
+          <w:sz w:val="22"/>
+        </w:rPr>
+        <w:t>Click 'AI CAPA'</w:t>
+      </w:r>
+      <w:r>
+        <w:rPr>
+          <w:color w:val="64748B"/>
+          <w:sz w:val="20"/>
+        </w:rPr>
+        <w:t xml:space="preserve">  Opens the AI-generated CAPA dialog.</w:t>
       </w:r>
     </w:p>
     <w:p>
       <w:pPr>
-        <w:pStyle w:val="Heading3"/>
+        <w:ind w:left="227"/>
       </w:pPr>
       <w:r>
         <w:rPr>
-          <w:color w:val="302D29"/>
+          <w:b/>
+          <w:color w:val="8B6914"/>
+          <w:sz w:val="22"/>
         </w:rPr>
-        <w:t>Sample response</w:t>
+        <w:t xml:space="preserve">2. </w:t>
+      </w:r>
+      <w:r>
+        <w:rPr>
+          <w:b/>
+          <w:sz w:val="22"/>
+        </w:rPr>
+        <w:t>Fill the form</w:t>
+      </w:r>
+    </w:p>
+    <w:tbl>
+      <w:tblPr>
+        <w:tblStyle w:val="LightGrid"/>
+        <w:tblW w:type="auto" w:w="0"/>
+        <w:tblLook w:firstColumn="1" w:firstRow="1" w:lastColumn="0" w:lastRow="0" w:noHBand="0" w:noVBand="1" w:val="04A0"/>
+      </w:tblPr>
+      <w:tblGrid>
+        <w:gridCol w:w="4320"/>
+        <w:gridCol w:w="4320"/>
+      </w:tblGrid>
+      <w:tr>
+        <w:tc>
+          <w:tcPr>
+            <w:tcW w:type="dxa" w:w="4320"/>
+            <w:shd w:val="clear" w:color="auto" w:fill="FFF7E6"/>
+          </w:tcPr>
+          <w:p>
+            <w:r>
+              <w:rPr>
+                <w:b/>
+                <w:color w:val="8B6914"/>
+              </w:rPr>
+              <w:t>Field</w:t>
+            </w:r>
+          </w:p>
+        </w:tc>
+        <w:tc>
+          <w:tcPr>
+            <w:tcW w:type="dxa" w:w="4320"/>
+            <w:shd w:val="clear" w:color="auto" w:fill="FFF7E6"/>
+          </w:tcPr>
+          <w:p>
+            <w:r>
+              <w:rPr>
+                <w:b/>
+                <w:color w:val="8B6914"/>
+              </w:rPr>
+              <w:t>Value</w:t>
+            </w:r>
+          </w:p>
+        </w:tc>
+      </w:tr>
+      <w:tr>
+        <w:tc>
+          <w:tcPr>
+            <w:tcW w:type="dxa" w:w="4320"/>
+          </w:tcPr>
+          <w:p>
+            <w:r>
+              <w:rPr>
+                <w:sz w:val="18"/>
+              </w:rPr>
+              <w:t>Initial severity</w:t>
+            </w:r>
+          </w:p>
+        </w:tc>
+        <w:tc>
+          <w:tcPr>
+            <w:tcW w:type="dxa" w:w="4320"/>
+          </w:tcPr>
+          <w:p>
+            <w:r>
+              <w:rPr>
+                <w:sz w:val="18"/>
+              </w:rPr>
+              <w:t>High</w:t>
+            </w:r>
+          </w:p>
+        </w:tc>
+      </w:tr>
+      <w:tr>
+        <w:tc>
+          <w:tcPr>
+            <w:tcW w:type="dxa" w:w="4320"/>
+          </w:tcPr>
+          <w:p>
+            <w:r>
+              <w:rPr>
+                <w:sz w:val="18"/>
+              </w:rPr>
+              <w:t>Problem statement</w:t>
+            </w:r>
+          </w:p>
+        </w:tc>
+        <w:tc>
+          <w:tcPr>
+            <w:tcW w:type="dxa" w:w="4320"/>
+          </w:tcPr>
+          <w:p>
+            <w:r>
+              <w:rPr>
+                <w:sz w:val="18"/>
+              </w:rPr>
+              <w:t>(min 10 chars) Tablet hardness OOS — 4.2 kP vs 6–10 kP spec on TX-2026-099. Compression force log shows downward drift.</w:t>
+            </w:r>
+          </w:p>
+        </w:tc>
+      </w:tr>
+      <w:tr>
+        <w:tc>
+          <w:tcPr>
+            <w:tcW w:type="dxa" w:w="4320"/>
+          </w:tcPr>
+          <w:p>
+            <w:r>
+              <w:rPr>
+                <w:sz w:val="18"/>
+              </w:rPr>
+              <w:t>Source</w:t>
+            </w:r>
+          </w:p>
+        </w:tc>
+        <w:tc>
+          <w:tcPr>
+            <w:tcW w:type="dxa" w:w="4320"/>
+          </w:tcPr>
+          <w:p>
+            <w:r>
+              <w:rPr>
+                <w:sz w:val="18"/>
+              </w:rPr>
+              <w:t>Deviation Report</w:t>
+            </w:r>
+          </w:p>
+        </w:tc>
+      </w:tr>
+      <w:tr>
+        <w:tc>
+          <w:tcPr>
+            <w:tcW w:type="dxa" w:w="4320"/>
+          </w:tcPr>
+          <w:p>
+            <w:r>
+              <w:rPr>
+                <w:sz w:val="18"/>
+              </w:rPr>
+              <w:t>Area affected</w:t>
+            </w:r>
+          </w:p>
+        </w:tc>
+        <w:tc>
+          <w:tcPr>
+            <w:tcW w:type="dxa" w:w="4320"/>
+          </w:tcPr>
+          <w:p>
+            <w:r>
+              <w:rPr>
+                <w:sz w:val="18"/>
+              </w:rPr>
+              <w:t>Manufacturing - Compression Suite 1</w:t>
+            </w:r>
+          </w:p>
+        </w:tc>
+      </w:tr>
+      <w:tr>
+        <w:tc>
+          <w:tcPr>
+            <w:tcW w:type="dxa" w:w="4320"/>
+          </w:tcPr>
+          <w:p>
+            <w:r>
+              <w:rPr>
+                <w:sz w:val="18"/>
+              </w:rPr>
+              <w:t>Equipment / Product</w:t>
+            </w:r>
+          </w:p>
+        </w:tc>
+        <w:tc>
+          <w:tcPr>
+            <w:tcW w:type="dxa" w:w="4320"/>
+          </w:tcPr>
+          <w:p>
+            <w:r>
+              <w:rPr>
+                <w:sz w:val="18"/>
+              </w:rPr>
+              <w:t>Tablet Press (Korsch XL-100)</w:t>
+            </w:r>
+          </w:p>
+        </w:tc>
+      </w:tr>
+    </w:tbl>
+    <w:p>
+      <w:pPr>
+        <w:ind w:left="227"/>
+      </w:pPr>
+      <w:r>
+        <w:rPr>
+          <w:b/>
+          <w:color w:val="8B6914"/>
+          <w:sz w:val="22"/>
+        </w:rPr>
+        <w:t xml:space="preserve">3. </w:t>
+      </w:r>
+      <w:r>
+        <w:rPr>
+          <w:b/>
+          <w:sz w:val="22"/>
+        </w:rPr>
+        <w:t>Click 'Generate CAPA'</w:t>
+      </w:r>
+      <w:r>
+        <w:rPr>
+          <w:color w:val="64748B"/>
+          <w:sz w:val="20"/>
+        </w:rPr>
+        <w:t xml:space="preserve">  Backend takes 5–15 s. You'll see the generated CAPA-XXXX-XXX with a risk score and AI recommendation.</w:t>
       </w:r>
     </w:p>
     <w:p>
       <w:pPr>
-        <w:spacing w:after="120"/>
-        <w:ind w:left="283"/>
+        <w:ind w:left="227"/>
       </w:pPr>
       <w:r>
         <w:rPr>
-          <w:rFonts w:ascii="Consolas" w:hAnsi="Consolas"/>
-          <w:sz w:val="18"/>
-          <w:rFonts w:ascii="Consolas" w:hAnsi="Consolas"/>
-        </w:rPr>
-        <w:t>{</w:t>
-        <w:br/>
-        <w:t xml:space="preserve">  "capa_id": "CAPA-2026-304",</w:t>
-        <w:br/>
-        <w:t xml:space="preserve">  "customer_id": "CUST_001",</w:t>
-        <w:br/>
-        <w:t xml:space="preserve">  "status": "Open",</w:t>
-        <w:br/>
-        <w:t xml:space="preserve">  "created_at": "2026-04-30T12:30:26.922497",</w:t>
-        <w:br/>
-        <w:t xml:space="preserve">  "is_recurring": true,</w:t>
-        <w:br/>
-        <w:t xml:space="preserve">  "similar_capas": [</w:t>
-        <w:br/>
-        <w:t xml:space="preserve">    {</w:t>
-        <w:br/>
-        <w:t xml:space="preserve">      "capa_id": "CAPA-2023-089",</w:t>
-        <w:br/>
-        <w:t xml:space="preserve">      "similarity_score": 0.95,</w:t>
-        <w:br/>
-        <w:t xml:space="preserve">      "description": "Both involve coating defects on similar equipment.",</w:t>
-        <w:br/>
-        <w:t xml:space="preserve">      "was_effective": false</w:t>
-        <w:br/>
-        <w:t xml:space="preserve">    }</w:t>
-        <w:br/>
-        <w:t xml:space="preserve">  ],</w:t>
-        <w:br/>
-        <w:t xml:space="preserve">  "recurrence_alert": "Recurring coating defects detected, with prior ineffective CAPA.",</w:t>
-        <w:br/>
-        <w:t xml:space="preserve">  "pattern_detected": "Coating defects on coater equipment are recurring.",</w:t>
-        <w:br/>
-        <w:t xml:space="preserve">  "ai_recommendation": "Investigate root cause of coating defects on coater equipment.",</w:t>
-        <w:br/>
-        <w:t xml:space="preserve">  "risk_score": 0.85,</w:t>
-        <w:br/>
-        <w:t xml:space="preserve">  "message": "⚠️ RECURRING ISSUE — CAPA-2026-304 created. Escalation recommended."</w:t>
-        <w:br/>
-        <w:t>}</w:t>
-      </w:r>
-    </w:p>
-    <w:p>
-      <w:pPr>
-        <w:pStyle w:val="Heading3"/>
-      </w:pPr>
-      <w:r>
-        <w:rPr>
-          <w:color w:val="302D29"/>
-        </w:rPr>
-        <w:t>Sample inputs that produce rich responses</w:t>
-      </w:r>
-    </w:p>
-    <w:p>
-      <w:r>
-        <w:rPr>
-          <w:b w:val="0"/>
-          <w:i/>
+          <w:b/>
+          <w:color w:val="8B6914"/>
           <w:sz w:val="22"/>
         </w:rPr>
-        <w:t>These are validated examples; the first reliably triggers the recurring-issue path:</w:t>
+        <w:t xml:space="preserve">4. </w:t>
       </w:r>
-    </w:p>
-    <w:p>
       <w:r>
         <w:rPr>
           <w:b/>
-          <w:i w:val="0"/>
-          <w:color w:val="8B6914"/>
+          <w:sz w:val="22"/>
+        </w:rPr>
+        <w:t>Click 'Accept &amp; close'</w:t>
+      </w:r>
+      <w:r>
+        <w:rPr>
+          <w:color w:val="64748B"/>
           <w:sz w:val="20"/>
         </w:rPr>
-        <w:t>• Coating defects (recurring)</w:t>
-      </w:r>
-    </w:p>
-    <w:p>
-      <w:r>
-        <w:rPr>
-          <w:b w:val="0"/>
-          <w:i w:val="0"/>
-          <w:sz w:val="20"/>
-        </w:rPr>
-        <w:t>Source: Deviation · Area: Manufacturing - Coating Suite 2 · Equipment: Coater (GLATT GC-1000) · Severity: High</w:t>
-        <w:br/>
-        <w:t>Problem: Film coating thickness variation observed on tablet batch BX-2026-088. ~12% of units below spec at QC. Operator reports erratic spray pattern from gun #3.</w:t>
-      </w:r>
-    </w:p>
-    <w:p>
-      <w:r>
-        <w:rPr>
-          <w:b/>
-          <w:i w:val="0"/>
-          <w:color w:val="8B6914"/>
-          <w:sz w:val="20"/>
-        </w:rPr>
-        <w:t>• Tablet hardness OOS</w:t>
-      </w:r>
-    </w:p>
-    <w:p>
-      <w:r>
-        <w:rPr>
-          <w:b w:val="0"/>
-          <w:i w:val="0"/>
-          <w:sz w:val="20"/>
-        </w:rPr>
-        <w:t>Source: OOS · Area: Manufacturing - Compression Suite 1 · Equipment: Tablet Press (Korsch XL-100) · Severity: Critical</w:t>
-        <w:br/>
-        <w:t>Problem: Tablet hardness OOS — average 4.2 kP vs spec 6–10 kP on stratified sampling of batch TX-2026-044. Compression force log shows downward drift over 2 hrs.</w:t>
-      </w:r>
-    </w:p>
-    <w:p>
-      <w:r>
-        <w:rPr>
-          <w:b/>
-          <w:i w:val="0"/>
-          <w:color w:val="8B6914"/>
-          <w:sz w:val="20"/>
-        </w:rPr>
-        <w:t>• Cleaning validation failure</w:t>
-      </w:r>
-    </w:p>
-    <w:p>
-      <w:r>
-        <w:rPr>
-          <w:b w:val="0"/>
-          <w:i w:val="0"/>
-          <w:sz w:val="20"/>
-        </w:rPr>
-        <w:t>Source: Deviation · Area: API Manufacturing - Reactor Bay · Equipment: Reactor R-301 (Pfaudler 500L) · Severity: Critical</w:t>
-        <w:br/>
-        <w:t>Problem: Swab samples from CIP cycle on Reactor R-301 returned TOC 18 ppb against 10 ppb residue limit. Adjacent product changeover scheduled for tomorrow.</w:t>
-      </w:r>
-    </w:p>
-    <w:p>
-      <w:r>
-        <w:rPr>
-          <w:b/>
-          <w:i w:val="0"/>
-          <w:color w:val="8B6914"/>
-          <w:sz w:val="20"/>
-        </w:rPr>
-        <w:t>• HVAC excursion</w:t>
-      </w:r>
-    </w:p>
-    <w:p>
-      <w:r>
-        <w:rPr>
-          <w:b w:val="0"/>
-          <w:i w:val="0"/>
-          <w:sz w:val="20"/>
-        </w:rPr>
-        <w:t>Source: Deviation · Area: Sterile Filling - ISO 8 Cleanroom · Equipment: HVAC AHU-04 · Severity: Critical</w:t>
-        <w:br/>
-        <w:t>Problem: Class 100,000 cleanroom particle count exceeded action limit (0.5µm &gt; 3,520,000/m³) for 14 minutes during aseptic fill of batch SF-2026-012.</w:t>
-      </w:r>
-    </w:p>
-    <w:p>
-      <w:r>
-        <w:rPr>
-          <w:b w:val="0"/>
-          <w:i w:val="0"/>
-          <w:sz w:val="20"/>
-        </w:rPr>
-        <w:t>On Accept &amp; close, the user is navigated to the AI CAPA Lifecycle page (/ai-capa/[capaId]) so they can run the rest of the lifecycle.</w:t>
-      </w:r>
-    </w:p>
-    <w:p>
-      <w:r>
-        <w:br w:type="page"/>
-      </w:r>
-    </w:p>
-    <w:p>
-      <w:pPr>
-        <w:pStyle w:val="Heading1"/>
-      </w:pPr>
-      <w:r>
-        <w:rPr>
-          <w:color w:val="302D29"/>
-        </w:rPr>
-        <w:t>4. AI CAPA Lifecycle</w:t>
-      </w:r>
-    </w:p>
-    <w:p>
-      <w:r>
-        <w:rPr>
-          <w:b w:val="0"/>
-          <w:i w:val="0"/>
-          <w:sz w:val="22"/>
-        </w:rPr>
-        <w:t>The lifecycle page at /ai-capa/[capaId] is the operational centre for one CAPA. It loads every stage in parallel and presents each one as a card with either the data or a Submit button. Stages are gated — Action Plan unlocks once an RCA exists, Monitoring and Effectiveness unlock once the Action Plan exists, and Closure requires Effectiveness.</w:t>
+        <w:t xml:space="preserve">  The CAPA appears in the tracker table and you land on its lifecycle page.</w:t>
       </w:r>
     </w:p>
     <w:p>
@@ -1947,7 +921,7 @@
       <w:r>
         <w:drawing>
           <wp:inline xmlns:a="http://schemas.openxmlformats.org/drawingml/2006/main" xmlns:pic="http://schemas.openxmlformats.org/drawingml/2006/picture">
-            <wp:extent cx="5943600" cy="3807619"/>
+            <wp:extent cx="5486400" cy="2943000"/>
             <wp:docPr id="4" name="Picture 4"/>
             <wp:cNvGraphicFramePr>
               <a:graphicFrameLocks noChangeAspect="1"/>
@@ -1956,7 +930,7 @@
               <a:graphicData uri="http://schemas.openxmlformats.org/drawingml/2006/picture">
                 <pic:pic>
                   <pic:nvPicPr>
-                    <pic:cNvPr id="0" name="06-ai-capa-lifecycle.png"/>
+                    <pic:cNvPr id="0" name="04-ai-capa-modal.png"/>
                     <pic:cNvPicPr/>
                   </pic:nvPicPr>
                   <pic:blipFill>
@@ -1968,7 +942,7 @@
                   <pic:spPr>
                     <a:xfrm>
                       <a:off x="0" y="0"/>
-                      <a:ext cx="5943600" cy="3807619"/>
+                      <a:ext cx="5486400" cy="2943000"/>
                     </a:xfrm>
                     <a:prstGeom prst="rect"/>
                   </pic:spPr>
@@ -1989,299 +963,55 @@
           <w:color w:val="64748B"/>
           <w:sz w:val="18"/>
         </w:rPr>
-        <w:t>Figure — AI CAPA Lifecycle dashboard</w:t>
+        <w:t>Figure — AI CAPA generation modal</w:t>
       </w:r>
     </w:p>
     <w:p>
       <w:pPr>
-        <w:pStyle w:val="Heading2"/>
+        <w:pStyle w:val="ListBullet"/>
       </w:pPr>
       <w:r>
         <w:rPr>
-          <w:color w:val="302D29"/>
+          <w:color w:val="10B981"/>
+          <w:sz w:val="20"/>
         </w:rPr>
-        <w:t>RCA submission</w:t>
+        <w:t>✓  CAPA ID assigned (e.g. CAPA-2026-310).</w:t>
       </w:r>
     </w:p>
     <w:p>
       <w:pPr>
-        <w:spacing w:after="120"/>
-        <w:ind w:left="283"/>
+        <w:pStyle w:val="ListBullet"/>
       </w:pPr>
       <w:r>
         <w:rPr>
-          <w:rFonts w:ascii="Consolas" w:hAnsi="Consolas"/>
-          <w:sz w:val="18"/>
-          <w:rFonts w:ascii="Consolas" w:hAnsi="Consolas"/>
+          <w:color w:val="10B981"/>
+          <w:sz w:val="20"/>
         </w:rPr>
-        <w:t>POST /api/v1/rca/submit</w:t>
-        <w:br/>
-        <w:t>Headers: auth: &lt;access_token&gt;</w:t>
-        <w:br/>
-        <w:br/>
-        <w:t>{</w:t>
-        <w:br/>
-        <w:t xml:space="preserve">  "capa_id": "CAPA-2026-304",</w:t>
-        <w:br/>
-        <w:t xml:space="preserve">  "customer_id": "CUST_001",</w:t>
-        <w:br/>
-        <w:t xml:space="preserve">  "rca_method": "5-Why",</w:t>
-        <w:br/>
-        <w:t xml:space="preserve">  "evidence": "Operator log shows spray nozzle pressure drift over 2 hours."</w:t>
-        <w:br/>
-        <w:t>}</w:t>
+        <w:t>✓  Risk score and AI recommendation are populated.</w:t>
       </w:r>
     </w:p>
     <w:p>
       <w:pPr>
-        <w:pStyle w:val="Heading2"/>
+        <w:pStyle w:val="ListBullet"/>
       </w:pPr>
       <w:r>
         <w:rPr>
-          <w:color w:val="302D29"/>
+          <w:color w:val="10B981"/>
+          <w:sz w:val="20"/>
         </w:rPr>
-        <w:t>Action Plan submission</w:t>
+        <w:t>✓  Page navigates to /ai-capa/CAPA-XXXX-XXX.</w:t>
       </w:r>
     </w:p>
     <w:p>
       <w:pPr>
-        <w:spacing w:after="120"/>
-        <w:ind w:left="283"/>
+        <w:pStyle w:val="ListBullet"/>
       </w:pPr>
       <w:r>
         <w:rPr>
-          <w:rFonts w:ascii="Consolas" w:hAnsi="Consolas"/>
-          <w:sz w:val="18"/>
-          <w:rFonts w:ascii="Consolas" w:hAnsi="Consolas"/>
+          <w:color w:val="DC2626"/>
+          <w:sz w:val="20"/>
         </w:rPr>
-        <w:t>POST /api/v1/action-plan/submit</w:t>
-        <w:br/>
-        <w:t>Headers: auth: &lt;access_token&gt;</w:t>
-        <w:br/>
-        <w:br/>
-        <w:t>{</w:t>
-        <w:br/>
-        <w:t xml:space="preserve">  "capa_id": "CAPA-2026-304",</w:t>
-        <w:br/>
-        <w:t xml:space="preserve">  "customer_id": "CUST_001",</w:t>
-        <w:br/>
-        <w:t xml:space="preserve">  "rca_id": "RCA-2026-101",</w:t>
-        <w:br/>
-        <w:t xml:space="preserve">  "actions": [</w:t>
-        <w:br/>
-        <w:t xml:space="preserve">    {</w:t>
-        <w:br/>
-        <w:t xml:space="preserve">      "action_description": "Recalibrate spray nozzle gun #3 and update SOP",</w:t>
-        <w:br/>
-        <w:t xml:space="preserve">      "responsible_person": "QA Manager",</w:t>
-        <w:br/>
-        <w:t xml:space="preserve">      "due_date": "2026-05-15"</w:t>
-        <w:br/>
-        <w:t xml:space="preserve">    },</w:t>
-        <w:br/>
-        <w:t xml:space="preserve">    {</w:t>
-        <w:br/>
-        <w:t xml:space="preserve">      "action_description": "Retrain all operators on coater calibration",</w:t>
-        <w:br/>
-        <w:t xml:space="preserve">      "responsible_person": "Training Lead",</w:t>
-        <w:br/>
-        <w:t xml:space="preserve">      "due_date": "2026-05-30"</w:t>
-        <w:br/>
-        <w:t xml:space="preserve">    }</w:t>
-        <w:br/>
-        <w:t xml:space="preserve">  ]</w:t>
-        <w:br/>
-        <w:t>}</w:t>
-      </w:r>
-    </w:p>
-    <w:p>
-      <w:pPr>
-        <w:pStyle w:val="Heading2"/>
-      </w:pPr>
-      <w:r>
-        <w:rPr>
-          <w:color w:val="302D29"/>
-        </w:rPr>
-        <w:t>Monitoring check</w:t>
-      </w:r>
-    </w:p>
-    <w:p>
-      <w:pPr>
-        <w:spacing w:after="120"/>
-        <w:ind w:left="283"/>
-      </w:pPr>
-      <w:r>
-        <w:rPr>
-          <w:rFonts w:ascii="Consolas" w:hAnsi="Consolas"/>
-          <w:sz w:val="18"/>
-          <w:rFonts w:ascii="Consolas" w:hAnsi="Consolas"/>
-        </w:rPr>
-        <w:t>POST /api/v1/monitoring/check</w:t>
-        <w:br/>
-        <w:t>Headers: auth: &lt;access_token&gt;</w:t>
-        <w:br/>
-        <w:br/>
-        <w:t>{</w:t>
-        <w:br/>
-        <w:t xml:space="preserve">  "capa_id": "CAPA-2026-304",</w:t>
-        <w:br/>
-        <w:t xml:space="preserve">  "customer_id": "CUST_001",</w:t>
-        <w:br/>
-        <w:t xml:space="preserve">  "action_plan_id": "AP-2026-201",</w:t>
-        <w:br/>
-        <w:t xml:space="preserve">  "action_updates": [</w:t>
-        <w:br/>
-        <w:t xml:space="preserve">    {</w:t>
-        <w:br/>
-        <w:t xml:space="preserve">      "action_description": "Recalibrate spray nozzle gun #3",</w:t>
-        <w:br/>
-        <w:t xml:space="preserve">      "responsible_person": "QA Manager",</w:t>
-        <w:br/>
-        <w:t xml:space="preserve">      "due_date": "2026-05-15",</w:t>
-        <w:br/>
-        <w:t xml:space="preserve">      "status": "Completed",</w:t>
-        <w:br/>
-        <w:t xml:space="preserve">      "progress_note": "Calibrated 2026-05-12; new SOP issued"</w:t>
-        <w:br/>
-        <w:t xml:space="preserve">    }</w:t>
-        <w:br/>
-        <w:t xml:space="preserve">  ]</w:t>
-        <w:br/>
-        <w:t>}</w:t>
-      </w:r>
-    </w:p>
-    <w:p>
-      <w:pPr>
-        <w:pStyle w:val="Heading2"/>
-      </w:pPr>
-      <w:r>
-        <w:rPr>
-          <w:color w:val="302D29"/>
-        </w:rPr>
-        <w:t>Effectiveness check</w:t>
-      </w:r>
-    </w:p>
-    <w:p>
-      <w:pPr>
-        <w:spacing w:after="120"/>
-        <w:ind w:left="283"/>
-      </w:pPr>
-      <w:r>
-        <w:rPr>
-          <w:rFonts w:ascii="Consolas" w:hAnsi="Consolas"/>
-          <w:sz w:val="18"/>
-          <w:rFonts w:ascii="Consolas" w:hAnsi="Consolas"/>
-        </w:rPr>
-        <w:t>POST /api/v1/effectiveness/check</w:t>
-        <w:br/>
-        <w:t>Headers: auth: &lt;access_token&gt;</w:t>
-        <w:br/>
-        <w:br/>
-        <w:t>{</w:t>
-        <w:br/>
-        <w:t xml:space="preserve">  "capa_id": "CAPA-2026-304",</w:t>
-        <w:br/>
-        <w:t xml:space="preserve">  "customer_id": "CUST_001",</w:t>
-        <w:br/>
-        <w:t xml:space="preserve">  "action_plan_id": "AP-2026-201",</w:t>
-        <w:br/>
-        <w:t xml:space="preserve">  "days_since_capa": 90,</w:t>
-        <w:br/>
-        <w:t xml:space="preserve">  "evidence_items": [</w:t>
-        <w:br/>
-        <w:t xml:space="preserve">    {</w:t>
-        <w:br/>
-        <w:t xml:space="preserve">      "action_description": "Recalibrate spray nozzle gun #3",</w:t>
-        <w:br/>
-        <w:t xml:space="preserve">      "completed": true,</w:t>
-        <w:br/>
-        <w:t xml:space="preserve">      "evidence_attached": true,</w:t>
-        <w:br/>
-        <w:t xml:space="preserve">      "evidence_note": "Calibration record + updated SOP attached"</w:t>
-        <w:br/>
-        <w:t xml:space="preserve">    }</w:t>
-        <w:br/>
-        <w:t xml:space="preserve">  ],</w:t>
-        <w:br/>
-        <w:t xml:space="preserve">  "trend_data": [</w:t>
-        <w:br/>
-        <w:t xml:space="preserve">    {</w:t>
-        <w:br/>
-        <w:t xml:space="preserve">      "metric_name": "Coating defects",</w:t>
-        <w:br/>
-        <w:t xml:space="preserve">      "before_capa": 4.2,</w:t>
-        <w:br/>
-        <w:t xml:space="preserve">      "after_capa": 0.5,</w:t>
-        <w:br/>
-        <w:t xml:space="preserve">      "unit": "per month"</w:t>
-        <w:br/>
-        <w:t xml:space="preserve">    }</w:t>
-        <w:br/>
-        <w:t xml:space="preserve">  ],</w:t>
-        <w:br/>
-        <w:t xml:space="preserve">  "new_issues_reported": false</w:t>
-        <w:br/>
-        <w:t>}</w:t>
-      </w:r>
-    </w:p>
-    <w:p>
-      <w:pPr>
-        <w:pStyle w:val="Heading2"/>
-      </w:pPr>
-      <w:r>
-        <w:rPr>
-          <w:color w:val="302D29"/>
-        </w:rPr>
-        <w:t>Closure</w:t>
-      </w:r>
-    </w:p>
-    <w:p>
-      <w:r>
-        <w:rPr>
-          <w:b w:val="0"/>
-          <w:i w:val="0"/>
-          <w:sz w:val="22"/>
-        </w:rPr>
-        <w:t>Closure is gated by Effectiveness and requires a 21 CFR Part 11 compliant electronic signature. The dialog warns that the signature is logged immutably.</w:t>
-      </w:r>
-    </w:p>
-    <w:p>
-      <w:pPr>
-        <w:spacing w:after="120"/>
-        <w:ind w:left="283"/>
-      </w:pPr>
-      <w:r>
-        <w:rPr>
-          <w:rFonts w:ascii="Consolas" w:hAnsi="Consolas"/>
-          <w:sz w:val="18"/>
-          <w:rFonts w:ascii="Consolas" w:hAnsi="Consolas"/>
-        </w:rPr>
-        <w:t>POST /api/v1/closure/initiate</w:t>
-        <w:br/>
-        <w:t>Headers: auth: &lt;access_token&gt;</w:t>
-        <w:br/>
-        <w:br/>
-        <w:t>{</w:t>
-        <w:br/>
-        <w:t xml:space="preserve">  "capa_id": "CAPA-2026-304",</w:t>
-        <w:br/>
-        <w:t xml:space="preserve">  "customer_id": "CUST_001",</w:t>
-        <w:br/>
-        <w:t xml:space="preserve">  "effectiveness_id": "EFF-2026-501",</w:t>
-        <w:br/>
-        <w:t xml:space="preserve">  "approved_by": "Dr. Priya Sharma",</w:t>
-        <w:br/>
-        <w:t xml:space="preserve">  "designation": "QA Head",</w:t>
-        <w:br/>
-        <w:t xml:space="preserve">  "electronic_signature": "PS-2026-QA",</w:t>
-        <w:br/>
-        <w:t xml:space="preserve">  "closure_rationale": "All actions completed with evidence. No recurrence in 90 days.",</w:t>
-        <w:br/>
-        <w:t xml:space="preserve">  "related_capas_reviewed": true,</w:t>
-        <w:br/>
-        <w:t xml:space="preserve">  "document_changes_approved": true</w:t>
-        <w:br/>
-        <w:t>}</w:t>
+        <w:t>!  If you submit the same recurring problem twice you get a recurrence alert with a Dismiss-alert button — that requires a justification ≥ 5 chars and an electronic signature.</w:t>
       </w:r>
     </w:p>
     <w:p>
@@ -2297,7 +1027,7 @@
         <w:rPr>
           <w:color w:val="302D29"/>
         </w:rPr>
-        <w:t>5. Dismissing recurrence alerts</w:t>
+        <w:t>4. CAPA lifecycle (5 stages)</w:t>
       </w:r>
     </w:p>
     <w:p>
@@ -2307,64 +1037,7 @@
           <w:i w:val="0"/>
           <w:sz w:val="22"/>
         </w:rPr>
-        <w:t>When the AI CAPA result panel surfaces a recurrence alert, a Dismiss alert button sits directly under it. Clicking expands an inline form with a reason field (≥ 5 characters) and an electronic signature field. The dismissal is logged in the audit trail with dismissed_by set to the logged-in user's name.</w:t>
-      </w:r>
-    </w:p>
-    <w:p>
-      <w:pPr>
-        <w:spacing w:after="120"/>
-        <w:ind w:left="283"/>
-      </w:pPr>
-      <w:r>
-        <w:rPr>
-          <w:rFonts w:ascii="Consolas" w:hAnsi="Consolas"/>
-          <w:sz w:val="18"/>
-          <w:rFonts w:ascii="Consolas" w:hAnsi="Consolas"/>
-        </w:rPr>
-        <w:t>POST /api/v1/capa/dismiss-alert</w:t>
-        <w:br/>
-        <w:t>Headers: auth: &lt;access_token&gt;</w:t>
-        <w:br/>
-        <w:br/>
-        <w:t>{</w:t>
-        <w:br/>
-        <w:t xml:space="preserve">  "capa_id": "CAPA-2026-304",</w:t>
-        <w:br/>
-        <w:t xml:space="preserve">  "alert_type": "recurrence_alert",</w:t>
-        <w:br/>
-        <w:t xml:space="preserve">  "dismissal_reason": "Investigated and confirmed different root cause; see RCA-2026-101.",</w:t>
-        <w:br/>
-        <w:t xml:space="preserve">  "electronic_signature": "PS-2026-001",</w:t>
-        <w:br/>
-        <w:t xml:space="preserve">  "dismissed_by": "Dr. Priya Sharma"</w:t>
-        <w:br/>
-        <w:t>}</w:t>
-      </w:r>
-    </w:p>
-    <w:p>
-      <w:r>
-        <w:br w:type="page"/>
-      </w:r>
-    </w:p>
-    <w:p>
-      <w:pPr>
-        <w:pStyle w:val="Heading1"/>
-      </w:pPr>
-      <w:r>
-        <w:rPr>
-          <w:color w:val="302D29"/>
-        </w:rPr>
-        <w:t>6. AI CAPA index</w:t>
-      </w:r>
-    </w:p>
-    <w:p>
-      <w:r>
-        <w:rPr>
-          <w:b w:val="0"/>
-          <w:i w:val="0"/>
-          <w:sz w:val="22"/>
-        </w:rPr>
-        <w:t>The /ai-capa page lists every backend CAPA for the current customer, with quick stats (total / open / recurring / high risk), per-row severity / status / risk-score badges, and click-through to the lifecycle page. Super admins also get a My customer / All customers toggle.</w:t>
+        <w:t>Each CAPA progresses through 5 backend-tracked stages. The lifecycle page (/ai-capa/{capa_id}) gates each stage on the previous one, so you must submit them in order.</w:t>
       </w:r>
     </w:p>
     <w:p>
@@ -2374,7 +1047,7 @@
       <w:r>
         <w:drawing>
           <wp:inline xmlns:a="http://schemas.openxmlformats.org/drawingml/2006/main" xmlns:pic="http://schemas.openxmlformats.org/drawingml/2006/picture">
-            <wp:extent cx="5943600" cy="3807619"/>
+            <wp:extent cx="5486400" cy="3514725"/>
             <wp:docPr id="5" name="Picture 5"/>
             <wp:cNvGraphicFramePr>
               <a:graphicFrameLocks noChangeAspect="1"/>
@@ -2383,7 +1056,7 @@
               <a:graphicData uri="http://schemas.openxmlformats.org/drawingml/2006/picture">
                 <pic:pic>
                   <pic:nvPicPr>
-                    <pic:cNvPr id="0" name="05-ai-capa-index.png"/>
+                    <pic:cNvPr id="0" name="06-ai-capa-lifecycle.png"/>
                     <pic:cNvPicPr/>
                   </pic:nvPicPr>
                   <pic:blipFill>
@@ -2395,7 +1068,7 @@
                   <pic:spPr>
                     <a:xfrm>
                       <a:off x="0" y="0"/>
-                      <a:ext cx="5943600" cy="3807619"/>
+                      <a:ext cx="5486400" cy="3514725"/>
                     </a:xfrm>
                     <a:prstGeom prst="rect"/>
                   </pic:spPr>
@@ -2416,69 +1089,865 @@
           <w:color w:val="64748B"/>
           <w:sz w:val="18"/>
         </w:rPr>
-        <w:t>Figure — AI CAPAs index</w:t>
+        <w:t>Figure — Lifecycle page — 5 cards, gated by stage</w:t>
       </w:r>
     </w:p>
     <w:p>
       <w:pPr>
-        <w:pStyle w:val="Heading3"/>
+        <w:pStyle w:val="Heading2"/>
       </w:pPr>
       <w:r>
         <w:rPr>
           <w:color w:val="302D29"/>
         </w:rPr>
-        <w:t>Sample response (capa/customer)</w:t>
+        <w:t>4.1  Submit RCA</w:t>
       </w:r>
     </w:p>
     <w:p>
       <w:pPr>
-        <w:spacing w:after="120"/>
-        <w:ind w:left="283"/>
+        <w:ind w:left="227"/>
       </w:pPr>
       <w:r>
         <w:rPr>
-          <w:rFonts w:ascii="Consolas" w:hAnsi="Consolas"/>
-          <w:sz w:val="18"/>
-          <w:rFonts w:ascii="Consolas" w:hAnsi="Consolas"/>
+          <w:b/>
+          <w:color w:val="8B6914"/>
+          <w:sz w:val="22"/>
         </w:rPr>
-        <w:t>GET /api/v1/capa/customer/CUST_001</w:t>
-        <w:br/>
-        <w:t>Headers: auth: &lt;access_token&gt;</w:t>
-        <w:br/>
-        <w:br/>
-        <w:t>200 OK</w:t>
-        <w:br/>
-        <w:t>{</w:t>
-        <w:br/>
-        <w:t xml:space="preserve">  "customer_id": "CUST_001",</w:t>
-        <w:br/>
-        <w:t xml:space="preserve">  "total": 4,</w:t>
-        <w:br/>
-        <w:t xml:space="preserve">  "capas": [</w:t>
-        <w:br/>
-        <w:t xml:space="preserve">    {</w:t>
-        <w:br/>
-        <w:t xml:space="preserve">      "capa_id": "CAPA-2026-304",</w:t>
-        <w:br/>
-        <w:t xml:space="preserve">      "problem_statement": "tablet coating",</w:t>
-        <w:br/>
-        <w:t xml:space="preserve">      "source": "deviation",</w:t>
-        <w:br/>
-        <w:t xml:space="preserve">      "severity": "major",</w:t>
-        <w:br/>
-        <w:t xml:space="preserve">      "status": "Open",</w:t>
-        <w:br/>
-        <w:t xml:space="preserve">      "is_recurring": true,</w:t>
-        <w:br/>
-        <w:t xml:space="preserve">      "risk_score": 0.85,</w:t>
-        <w:br/>
-        <w:t xml:space="preserve">      "created_at": "2026-04-30T12:30:26.922497"</w:t>
-        <w:br/>
-        <w:t xml:space="preserve">    }</w:t>
-        <w:br/>
-        <w:t xml:space="preserve">  ]</w:t>
-        <w:br/>
-        <w:t>}</w:t>
+        <w:t xml:space="preserve">1. </w:t>
+      </w:r>
+      <w:r>
+        <w:rPr>
+          <w:b/>
+          <w:sz w:val="22"/>
+        </w:rPr>
+        <w:t>Click 'Submit RCA'</w:t>
+      </w:r>
+      <w:r>
+        <w:rPr>
+          <w:color w:val="64748B"/>
+          <w:sz w:val="20"/>
+        </w:rPr>
+        <w:t xml:space="preserve">  Opens the RCA dialog.</w:t>
+      </w:r>
+    </w:p>
+    <w:p>
+      <w:pPr>
+        <w:ind w:left="227"/>
+      </w:pPr>
+      <w:r>
+        <w:rPr>
+          <w:b/>
+          <w:color w:val="8B6914"/>
+          <w:sz w:val="22"/>
+        </w:rPr>
+        <w:t xml:space="preserve">2. </w:t>
+      </w:r>
+      <w:r>
+        <w:rPr>
+          <w:b/>
+          <w:sz w:val="22"/>
+        </w:rPr>
+        <w:t>Pick a method</w:t>
+      </w:r>
+      <w:r>
+        <w:rPr>
+          <w:color w:val="64748B"/>
+          <w:sz w:val="20"/>
+        </w:rPr>
+        <w:t xml:space="preserve">  e.g. Fishbone Diagram (any value works).</w:t>
+      </w:r>
+    </w:p>
+    <w:p>
+      <w:pPr>
+        <w:ind w:left="227"/>
+      </w:pPr>
+      <w:r>
+        <w:rPr>
+          <w:b/>
+          <w:color w:val="8B6914"/>
+          <w:sz w:val="22"/>
+        </w:rPr>
+        <w:t xml:space="preserve">3. </w:t>
+      </w:r>
+      <w:r>
+        <w:rPr>
+          <w:b/>
+          <w:sz w:val="22"/>
+        </w:rPr>
+        <w:t>Enter evidence</w:t>
+      </w:r>
+      <w:r>
+        <w:rPr>
+          <w:color w:val="64748B"/>
+          <w:sz w:val="20"/>
+        </w:rPr>
+        <w:t xml:space="preserve">  Free-text root cause description. Example: 'Compression force calibration drifted out of spec due to wear on tablet press feedback sensor.'</w:t>
+      </w:r>
+    </w:p>
+    <w:p>
+      <w:pPr>
+        <w:ind w:left="227"/>
+      </w:pPr>
+      <w:r>
+        <w:rPr>
+          <w:b/>
+          <w:color w:val="8B6914"/>
+          <w:sz w:val="22"/>
+        </w:rPr>
+        <w:t xml:space="preserve">4. </w:t>
+      </w:r>
+      <w:r>
+        <w:rPr>
+          <w:b/>
+          <w:sz w:val="22"/>
+        </w:rPr>
+        <w:t>Submit</w:t>
+      </w:r>
+      <w:r>
+        <w:rPr>
+          <w:color w:val="64748B"/>
+          <w:sz w:val="20"/>
+        </w:rPr>
+        <w:t xml:space="preserve">  Backend returns RCA-XXXX-XXX. Lifecycle status flips to 'RCA Submitted'.</w:t>
+      </w:r>
+    </w:p>
+    <w:p>
+      <w:pPr>
+        <w:pStyle w:val="ListBullet"/>
+      </w:pPr>
+      <w:r>
+        <w:rPr>
+          <w:color w:val="10B981"/>
+          <w:sz w:val="20"/>
+        </w:rPr>
+        <w:t>✓  RCA card now shows the assigned RCA ID and root cause.</w:t>
+      </w:r>
+    </w:p>
+    <w:p>
+      <w:pPr>
+        <w:pStyle w:val="ListBullet"/>
+      </w:pPr>
+      <w:r>
+        <w:rPr>
+          <w:color w:val="10B981"/>
+          <w:sz w:val="20"/>
+        </w:rPr>
+        <w:t>✓  Action Plan card unlocks.</w:t>
+      </w:r>
+    </w:p>
+    <w:p>
+      <w:pPr>
+        <w:pStyle w:val="Heading2"/>
+      </w:pPr>
+      <w:r>
+        <w:rPr>
+          <w:color w:val="302D29"/>
+        </w:rPr>
+        <w:t>4.2  Submit Action Plan</w:t>
+      </w:r>
+    </w:p>
+    <w:p>
+      <w:pPr>
+        <w:ind w:left="227"/>
+      </w:pPr>
+      <w:r>
+        <w:rPr>
+          <w:b/>
+          <w:color w:val="8B6914"/>
+          <w:sz w:val="22"/>
+        </w:rPr>
+        <w:t xml:space="preserve">1. </w:t>
+      </w:r>
+      <w:r>
+        <w:rPr>
+          <w:b/>
+          <w:sz w:val="22"/>
+        </w:rPr>
+        <w:t>Click 'Submit action plan'</w:t>
+      </w:r>
+    </w:p>
+    <w:p>
+      <w:pPr>
+        <w:ind w:left="227"/>
+      </w:pPr>
+      <w:r>
+        <w:rPr>
+          <w:b/>
+          <w:color w:val="8B6914"/>
+          <w:sz w:val="22"/>
+        </w:rPr>
+        <w:t xml:space="preserve">2. </w:t>
+      </w:r>
+      <w:r>
+        <w:rPr>
+          <w:b/>
+          <w:sz w:val="22"/>
+        </w:rPr>
+        <w:t>Enter at least one action row</w:t>
+      </w:r>
+    </w:p>
+    <w:tbl>
+      <w:tblPr>
+        <w:tblStyle w:val="LightGrid"/>
+        <w:tblW w:type="auto" w:w="0"/>
+        <w:tblLook w:firstColumn="1" w:firstRow="1" w:lastColumn="0" w:lastRow="0" w:noHBand="0" w:noVBand="1" w:val="04A0"/>
+      </w:tblPr>
+      <w:tblGrid>
+        <w:gridCol w:w="4320"/>
+        <w:gridCol w:w="4320"/>
+      </w:tblGrid>
+      <w:tr>
+        <w:tc>
+          <w:tcPr>
+            <w:tcW w:type="dxa" w:w="4320"/>
+            <w:shd w:val="clear" w:color="auto" w:fill="FFF7E6"/>
+          </w:tcPr>
+          <w:p>
+            <w:r>
+              <w:rPr>
+                <w:b/>
+                <w:color w:val="8B6914"/>
+              </w:rPr>
+              <w:t>Field</w:t>
+            </w:r>
+          </w:p>
+        </w:tc>
+        <w:tc>
+          <w:tcPr>
+            <w:tcW w:type="dxa" w:w="4320"/>
+            <w:shd w:val="clear" w:color="auto" w:fill="FFF7E6"/>
+          </w:tcPr>
+          <w:p>
+            <w:r>
+              <w:rPr>
+                <w:b/>
+                <w:color w:val="8B6914"/>
+              </w:rPr>
+              <w:t>Value</w:t>
+            </w:r>
+          </w:p>
+        </w:tc>
+      </w:tr>
+      <w:tr>
+        <w:tc>
+          <w:tcPr>
+            <w:tcW w:type="dxa" w:w="4320"/>
+          </w:tcPr>
+          <w:p>
+            <w:r>
+              <w:rPr>
+                <w:sz w:val="18"/>
+              </w:rPr>
+              <w:t>Action</w:t>
+            </w:r>
+          </w:p>
+        </w:tc>
+        <w:tc>
+          <w:tcPr>
+            <w:tcW w:type="dxa" w:w="4320"/>
+          </w:tcPr>
+          <w:p>
+            <w:r>
+              <w:rPr>
+                <w:sz w:val="18"/>
+              </w:rPr>
+              <w:t>Recalibrate Korsch XL-100 compression force sensor; reduce maintenance interval.</w:t>
+            </w:r>
+          </w:p>
+        </w:tc>
+      </w:tr>
+      <w:tr>
+        <w:tc>
+          <w:tcPr>
+            <w:tcW w:type="dxa" w:w="4320"/>
+          </w:tcPr>
+          <w:p>
+            <w:r>
+              <w:rPr>
+                <w:sz w:val="18"/>
+              </w:rPr>
+              <w:t>Responsible</w:t>
+            </w:r>
+          </w:p>
+        </w:tc>
+        <w:tc>
+          <w:tcPr>
+            <w:tcW w:type="dxa" w:w="4320"/>
+          </w:tcPr>
+          <w:p>
+            <w:r>
+              <w:rPr>
+                <w:sz w:val="18"/>
+              </w:rPr>
+              <w:t>Mr. Rajesh Kumar (Maintenance Lead)</w:t>
+            </w:r>
+          </w:p>
+        </w:tc>
+      </w:tr>
+      <w:tr>
+        <w:tc>
+          <w:tcPr>
+            <w:tcW w:type="dxa" w:w="4320"/>
+          </w:tcPr>
+          <w:p>
+            <w:r>
+              <w:rPr>
+                <w:sz w:val="18"/>
+              </w:rPr>
+              <w:t>Due date</w:t>
+            </w:r>
+          </w:p>
+        </w:tc>
+        <w:tc>
+          <w:tcPr>
+            <w:tcW w:type="dxa" w:w="4320"/>
+          </w:tcPr>
+          <w:p>
+            <w:r>
+              <w:rPr>
+                <w:sz w:val="18"/>
+              </w:rPr>
+              <w:t>Pick any future date, e.g. 2026-06-15</w:t>
+            </w:r>
+          </w:p>
+        </w:tc>
+      </w:tr>
+    </w:tbl>
+    <w:p>
+      <w:pPr>
+        <w:ind w:left="227"/>
+      </w:pPr>
+      <w:r>
+        <w:rPr>
+          <w:b/>
+          <w:color w:val="8B6914"/>
+          <w:sz w:val="22"/>
+        </w:rPr>
+        <w:t xml:space="preserve">3. </w:t>
+      </w:r>
+      <w:r>
+        <w:rPr>
+          <w:b/>
+          <w:sz w:val="22"/>
+        </w:rPr>
+        <w:t>Submit</w:t>
+      </w:r>
+      <w:r>
+        <w:rPr>
+          <w:color w:val="64748B"/>
+          <w:sz w:val="20"/>
+        </w:rPr>
+        <w:t xml:space="preserve">  Returns AP-XXXX-XXX. Status flips to 'Action Plan Submitted'.</w:t>
+      </w:r>
+    </w:p>
+    <w:p>
+      <w:pPr>
+        <w:pStyle w:val="Heading2"/>
+      </w:pPr>
+      <w:r>
+        <w:rPr>
+          <w:color w:val="302D29"/>
+        </w:rPr>
+        <w:t>4.3  Submit Monitoring Check</w:t>
+      </w:r>
+    </w:p>
+    <w:p>
+      <w:pPr>
+        <w:ind w:left="227"/>
+      </w:pPr>
+      <w:r>
+        <w:rPr>
+          <w:b/>
+          <w:color w:val="8B6914"/>
+          <w:sz w:val="22"/>
+        </w:rPr>
+        <w:t xml:space="preserve">1. </w:t>
+      </w:r>
+      <w:r>
+        <w:rPr>
+          <w:b/>
+          <w:sz w:val="22"/>
+        </w:rPr>
+        <w:t>Click 'Submit monitoring check'</w:t>
+      </w:r>
+    </w:p>
+    <w:p>
+      <w:pPr>
+        <w:ind w:left="227"/>
+      </w:pPr>
+      <w:r>
+        <w:rPr>
+          <w:b/>
+          <w:color w:val="8B6914"/>
+          <w:sz w:val="22"/>
+        </w:rPr>
+        <w:t xml:space="preserve">2. </w:t>
+      </w:r>
+      <w:r>
+        <w:rPr>
+          <w:b/>
+          <w:sz w:val="22"/>
+        </w:rPr>
+        <w:t>Status</w:t>
+      </w:r>
+      <w:r>
+        <w:rPr>
+          <w:color w:val="64748B"/>
+          <w:sz w:val="20"/>
+        </w:rPr>
+        <w:t xml:space="preserve">  Pick from On Track / In Progress / Overdue / Completed (these match the backend enum exactly — 'Delayed' / 'Blocked' will fail).</w:t>
+      </w:r>
+    </w:p>
+    <w:p>
+      <w:pPr>
+        <w:ind w:left="227"/>
+      </w:pPr>
+      <w:r>
+        <w:rPr>
+          <w:b/>
+          <w:color w:val="8B6914"/>
+          <w:sz w:val="22"/>
+        </w:rPr>
+        <w:t xml:space="preserve">3. </w:t>
+      </w:r>
+      <w:r>
+        <w:rPr>
+          <w:b/>
+          <w:sz w:val="22"/>
+        </w:rPr>
+        <w:t>Note</w:t>
+      </w:r>
+      <w:r>
+        <w:rPr>
+          <w:color w:val="64748B"/>
+          <w:sz w:val="20"/>
+        </w:rPr>
+        <w:t xml:space="preserve">  Free-text progress note.</w:t>
+      </w:r>
+    </w:p>
+    <w:p>
+      <w:pPr>
+        <w:ind w:left="227"/>
+      </w:pPr>
+      <w:r>
+        <w:rPr>
+          <w:b/>
+          <w:color w:val="8B6914"/>
+          <w:sz w:val="22"/>
+        </w:rPr>
+        <w:t xml:space="preserve">4. </w:t>
+      </w:r>
+      <w:r>
+        <w:rPr>
+          <w:b/>
+          <w:sz w:val="22"/>
+        </w:rPr>
+        <w:t>Submit</w:t>
+      </w:r>
+      <w:r>
+        <w:rPr>
+          <w:color w:val="64748B"/>
+          <w:sz w:val="20"/>
+        </w:rPr>
+        <w:t xml:space="preserve">  Returns MON-XXXX-XXX. Status flips to 'Monitoring Complete' once Completed.</w:t>
+      </w:r>
+    </w:p>
+    <w:p>
+      <w:pPr>
+        <w:pStyle w:val="Heading2"/>
+      </w:pPr>
+      <w:r>
+        <w:rPr>
+          <w:color w:val="302D29"/>
+        </w:rPr>
+        <w:t>4.4  Run Effectiveness Check</w:t>
+      </w:r>
+    </w:p>
+    <w:p>
+      <w:pPr>
+        <w:ind w:left="227"/>
+      </w:pPr>
+      <w:r>
+        <w:rPr>
+          <w:b/>
+          <w:color w:val="8B6914"/>
+          <w:sz w:val="22"/>
+        </w:rPr>
+        <w:t xml:space="preserve">1. </w:t>
+      </w:r>
+      <w:r>
+        <w:rPr>
+          <w:b/>
+          <w:sz w:val="22"/>
+        </w:rPr>
+        <w:t>Click 'Run effectiveness check'</w:t>
+      </w:r>
+    </w:p>
+    <w:p>
+      <w:pPr>
+        <w:ind w:left="227"/>
+      </w:pPr>
+      <w:r>
+        <w:rPr>
+          <w:b/>
+          <w:color w:val="8B6914"/>
+          <w:sz w:val="22"/>
+        </w:rPr>
+        <w:t xml:space="preserve">2. </w:t>
+      </w:r>
+      <w:r>
+        <w:rPr>
+          <w:b/>
+          <w:sz w:val="22"/>
+        </w:rPr>
+        <w:t>Fill the form</w:t>
+      </w:r>
+      <w:r>
+        <w:rPr>
+          <w:color w:val="64748B"/>
+          <w:sz w:val="20"/>
+        </w:rPr>
+        <w:t xml:space="preserve">  Days since CAPA = 90, New issues = No, Action description, Completed = Yes, Evidence = Attached, Note, plus a Metric block (e.g. Tablet hardness 4.2 → 7.8 kP).</w:t>
+      </w:r>
+    </w:p>
+    <w:p>
+      <w:pPr>
+        <w:ind w:left="227"/>
+      </w:pPr>
+      <w:r>
+        <w:rPr>
+          <w:b/>
+          <w:color w:val="8B6914"/>
+          <w:sz w:val="22"/>
+        </w:rPr>
+        <w:t xml:space="preserve">3. </w:t>
+      </w:r>
+      <w:r>
+        <w:rPr>
+          <w:b/>
+          <w:sz w:val="22"/>
+        </w:rPr>
+        <w:t>Submit</w:t>
+      </w:r>
+      <w:r>
+        <w:rPr>
+          <w:color w:val="64748B"/>
+          <w:sz w:val="20"/>
+        </w:rPr>
+        <w:t xml:space="preserve">  Returns EFF-XXXX-XXX.</w:t>
+      </w:r>
+    </w:p>
+    <w:p>
+      <w:pPr>
+        <w:pStyle w:val="ListBullet"/>
+      </w:pPr>
+      <w:r>
+        <w:rPr>
+          <w:color w:val="10B981"/>
+          <w:sz w:val="20"/>
+        </w:rPr>
+        <w:t>✓  Effectiveness verdict shown (Effective / Partially Effective / Not Effective).</w:t>
+      </w:r>
+    </w:p>
+    <w:p>
+      <w:pPr>
+        <w:pStyle w:val="Heading2"/>
+      </w:pPr>
+      <w:r>
+        <w:rPr>
+          <w:color w:val="302D29"/>
+        </w:rPr>
+        <w:t>4.5  Initiate Closure</w:t>
+      </w:r>
+    </w:p>
+    <w:p>
+      <w:pPr>
+        <w:ind w:left="227"/>
+      </w:pPr>
+      <w:r>
+        <w:rPr>
+          <w:b/>
+          <w:color w:val="8B6914"/>
+          <w:sz w:val="22"/>
+        </w:rPr>
+        <w:t xml:space="preserve">1. </w:t>
+      </w:r>
+      <w:r>
+        <w:rPr>
+          <w:b/>
+          <w:sz w:val="22"/>
+        </w:rPr>
+        <w:t>Click 'Initiate closure'</w:t>
+      </w:r>
+    </w:p>
+    <w:p>
+      <w:pPr>
+        <w:ind w:left="227"/>
+      </w:pPr>
+      <w:r>
+        <w:rPr>
+          <w:b/>
+          <w:color w:val="8B6914"/>
+          <w:sz w:val="22"/>
+        </w:rPr>
+        <w:t xml:space="preserve">2. </w:t>
+      </w:r>
+      <w:r>
+        <w:rPr>
+          <w:b/>
+          <w:sz w:val="22"/>
+        </w:rPr>
+        <w:t>Fill the closure form</w:t>
+      </w:r>
+    </w:p>
+    <w:tbl>
+      <w:tblPr>
+        <w:tblStyle w:val="LightGrid"/>
+        <w:tblW w:type="auto" w:w="0"/>
+        <w:tblLook w:firstColumn="1" w:firstRow="1" w:lastColumn="0" w:lastRow="0" w:noHBand="0" w:noVBand="1" w:val="04A0"/>
+      </w:tblPr>
+      <w:tblGrid>
+        <w:gridCol w:w="4320"/>
+        <w:gridCol w:w="4320"/>
+      </w:tblGrid>
+      <w:tr>
+        <w:tc>
+          <w:tcPr>
+            <w:tcW w:type="dxa" w:w="4320"/>
+            <w:shd w:val="clear" w:color="auto" w:fill="FFF7E6"/>
+          </w:tcPr>
+          <w:p>
+            <w:r>
+              <w:rPr>
+                <w:b/>
+                <w:color w:val="8B6914"/>
+              </w:rPr>
+              <w:t>Field</w:t>
+            </w:r>
+          </w:p>
+        </w:tc>
+        <w:tc>
+          <w:tcPr>
+            <w:tcW w:type="dxa" w:w="4320"/>
+            <w:shd w:val="clear" w:color="auto" w:fill="FFF7E6"/>
+          </w:tcPr>
+          <w:p>
+            <w:r>
+              <w:rPr>
+                <w:b/>
+                <w:color w:val="8B6914"/>
+              </w:rPr>
+              <w:t>Value</w:t>
+            </w:r>
+          </w:p>
+        </w:tc>
+      </w:tr>
+      <w:tr>
+        <w:tc>
+          <w:tcPr>
+            <w:tcW w:type="dxa" w:w="4320"/>
+          </w:tcPr>
+          <w:p>
+            <w:r>
+              <w:rPr>
+                <w:sz w:val="18"/>
+              </w:rPr>
+              <w:t>Approved by</w:t>
+            </w:r>
+          </w:p>
+        </w:tc>
+        <w:tc>
+          <w:tcPr>
+            <w:tcW w:type="dxa" w:w="4320"/>
+          </w:tcPr>
+          <w:p>
+            <w:r>
+              <w:rPr>
+                <w:sz w:val="18"/>
+              </w:rPr>
+              <w:t>Dr. Priya Sharma</w:t>
+            </w:r>
+          </w:p>
+        </w:tc>
+      </w:tr>
+      <w:tr>
+        <w:tc>
+          <w:tcPr>
+            <w:tcW w:type="dxa" w:w="4320"/>
+          </w:tcPr>
+          <w:p>
+            <w:r>
+              <w:rPr>
+                <w:sz w:val="18"/>
+              </w:rPr>
+              <w:t>Designation</w:t>
+            </w:r>
+          </w:p>
+        </w:tc>
+        <w:tc>
+          <w:tcPr>
+            <w:tcW w:type="dxa" w:w="4320"/>
+          </w:tcPr>
+          <w:p>
+            <w:r>
+              <w:rPr>
+                <w:sz w:val="18"/>
+              </w:rPr>
+              <w:t>QA Head</w:t>
+            </w:r>
+          </w:p>
+        </w:tc>
+      </w:tr>
+      <w:tr>
+        <w:tc>
+          <w:tcPr>
+            <w:tcW w:type="dxa" w:w="4320"/>
+          </w:tcPr>
+          <w:p>
+            <w:r>
+              <w:rPr>
+                <w:sz w:val="18"/>
+              </w:rPr>
+              <w:t>Electronic signature</w:t>
+            </w:r>
+          </w:p>
+        </w:tc>
+        <w:tc>
+          <w:tcPr>
+            <w:tcW w:type="dxa" w:w="4320"/>
+          </w:tcPr>
+          <w:p>
+            <w:r>
+              <w:rPr>
+                <w:sz w:val="18"/>
+              </w:rPr>
+              <w:t>QA-PSHARMA-2026-XXX (any unique string)</w:t>
+            </w:r>
+          </w:p>
+        </w:tc>
+      </w:tr>
+      <w:tr>
+        <w:tc>
+          <w:tcPr>
+            <w:tcW w:type="dxa" w:w="4320"/>
+          </w:tcPr>
+          <w:p>
+            <w:r>
+              <w:rPr>
+                <w:sz w:val="18"/>
+              </w:rPr>
+              <w:t>Related CAPAs reviewed?</w:t>
+            </w:r>
+          </w:p>
+        </w:tc>
+        <w:tc>
+          <w:tcPr>
+            <w:tcW w:type="dxa" w:w="4320"/>
+          </w:tcPr>
+          <w:p>
+            <w:r>
+              <w:rPr>
+                <w:sz w:val="18"/>
+              </w:rPr>
+              <w:t>Yes</w:t>
+            </w:r>
+          </w:p>
+        </w:tc>
+      </w:tr>
+      <w:tr>
+        <w:tc>
+          <w:tcPr>
+            <w:tcW w:type="dxa" w:w="4320"/>
+          </w:tcPr>
+          <w:p>
+            <w:r>
+              <w:rPr>
+                <w:sz w:val="18"/>
+              </w:rPr>
+              <w:t>Document changes approved?</w:t>
+            </w:r>
+          </w:p>
+        </w:tc>
+        <w:tc>
+          <w:tcPr>
+            <w:tcW w:type="dxa" w:w="4320"/>
+          </w:tcPr>
+          <w:p>
+            <w:r>
+              <w:rPr>
+                <w:sz w:val="18"/>
+              </w:rPr>
+              <w:t>Yes</w:t>
+            </w:r>
+          </w:p>
+        </w:tc>
+      </w:tr>
+      <w:tr>
+        <w:tc>
+          <w:tcPr>
+            <w:tcW w:type="dxa" w:w="4320"/>
+          </w:tcPr>
+          <w:p>
+            <w:r>
+              <w:rPr>
+                <w:sz w:val="18"/>
+              </w:rPr>
+              <w:t>Closure rationale</w:t>
+            </w:r>
+          </w:p>
+        </w:tc>
+        <w:tc>
+          <w:tcPr>
+            <w:tcW w:type="dxa" w:w="4320"/>
+          </w:tcPr>
+          <w:p>
+            <w:r>
+              <w:rPr>
+                <w:sz w:val="18"/>
+              </w:rPr>
+              <w:t>≥ 10 chars, e.g. '90-day window passed with no recurrence; SOP-MFG-042 updated.'</w:t>
+            </w:r>
+          </w:p>
+        </w:tc>
+      </w:tr>
+    </w:tbl>
+    <w:p>
+      <w:pPr>
+        <w:ind w:left="227"/>
+      </w:pPr>
+      <w:r>
+        <w:rPr>
+          <w:b/>
+          <w:color w:val="8B6914"/>
+          <w:sz w:val="22"/>
+        </w:rPr>
+        <w:t xml:space="preserve">3. </w:t>
+      </w:r>
+      <w:r>
+        <w:rPr>
+          <w:b/>
+          <w:sz w:val="22"/>
+        </w:rPr>
+        <w:t>Submit</w:t>
+      </w:r>
+      <w:r>
+        <w:rPr>
+          <w:color w:val="64748B"/>
+          <w:sz w:val="20"/>
+        </w:rPr>
+        <w:t xml:space="preserve">  Returns CLO-XXXX-XXX. CAPA status flips to 'Closed'.</w:t>
+      </w:r>
+    </w:p>
+    <w:p>
+      <w:pPr>
+        <w:pStyle w:val="ListBullet"/>
+      </w:pPr>
+      <w:r>
+        <w:rPr>
+          <w:color w:val="10B981"/>
+          <w:sz w:val="20"/>
+        </w:rPr>
+        <w:t>✓  All five lifecycle cards now show data.</w:t>
       </w:r>
     </w:p>
     <w:p>
@@ -2494,17 +1963,115 @@
         <w:rPr>
           <w:color w:val="302D29"/>
         </w:rPr>
-        <w:t>7. Audit Trail</w:t>
+        <w:t>5. AI Assistant (chatbot)</w:t>
       </w:r>
     </w:p>
     <w:p>
+      <w:pPr>
+        <w:ind w:left="227"/>
+      </w:pPr>
       <w:r>
         <w:rPr>
-          <w:b w:val="0"/>
-          <w:i w:val="0"/>
+          <w:b/>
+          <w:color w:val="8B6914"/>
           <w:sz w:val="22"/>
         </w:rPr>
-        <w:t>The Audit Trail page sits in the Readiness &amp; Governance section. The Local tab shows the in-app Redux audit log; the AI Backend tab fetches /api/v1/audit/all and renders the backend's audit_logs collection (action_type, feature_id, record_id, username, status, audit_id, timestamp).</w:t>
+        <w:t xml:space="preserve">1. </w:t>
+      </w:r>
+      <w:r>
+        <w:rPr>
+          <w:b/>
+          <w:sz w:val="22"/>
+        </w:rPr>
+        <w:t>Click the floating bubble</w:t>
+      </w:r>
+      <w:r>
+        <w:rPr>
+          <w:color w:val="64748B"/>
+          <w:sz w:val="20"/>
+        </w:rPr>
+        <w:t xml:space="preserve">  Bottom-right of every page.</w:t>
+      </w:r>
+    </w:p>
+    <w:p>
+      <w:pPr>
+        <w:ind w:left="227"/>
+      </w:pPr>
+      <w:r>
+        <w:rPr>
+          <w:b/>
+          <w:color w:val="8B6914"/>
+          <w:sz w:val="22"/>
+        </w:rPr>
+        <w:t xml:space="preserve">2. </w:t>
+      </w:r>
+      <w:r>
+        <w:rPr>
+          <w:b/>
+          <w:sz w:val="22"/>
+        </w:rPr>
+        <w:t>Send a text message</w:t>
+      </w:r>
+      <w:r>
+        <w:rPr>
+          <w:color w:val="64748B"/>
+          <w:sz w:val="20"/>
+        </w:rPr>
+        <w:t xml:space="preserve">  Try 'How many CAPAs do we have?' or 'Summarise the latest open deviations.'</w:t>
+      </w:r>
+    </w:p>
+    <w:p>
+      <w:pPr>
+        <w:ind w:left="227"/>
+      </w:pPr>
+      <w:r>
+        <w:rPr>
+          <w:b/>
+          <w:color w:val="8B6914"/>
+          <w:sz w:val="22"/>
+        </w:rPr>
+        <w:t xml:space="preserve">3. </w:t>
+      </w:r>
+      <w:r>
+        <w:rPr>
+          <w:b/>
+          <w:sz w:val="22"/>
+        </w:rPr>
+        <w:t>Click the speaker on the assistant reply</w:t>
+      </w:r>
+      <w:r>
+        <w:rPr>
+          <w:color w:val="64748B"/>
+          <w:sz w:val="20"/>
+        </w:rPr>
+        <w:t xml:space="preserve">  Plays back the response via OpenAI TTS.</w:t>
+      </w:r>
+    </w:p>
+    <w:p>
+      <w:pPr>
+        <w:ind w:left="227"/>
+      </w:pPr>
+      <w:r>
+        <w:rPr>
+          <w:b/>
+          <w:color w:val="8B6914"/>
+          <w:sz w:val="22"/>
+        </w:rPr>
+        <w:t xml:space="preserve">4. </w:t>
+      </w:r>
+      <w:r>
+        <w:rPr>
+          <w:b/>
+          <w:sz w:val="22"/>
+        </w:rPr>
+        <w:t>Try voice input</w:t>
+      </w:r>
+      <w:r>
+        <w:rPr>
+          <w:color w:val="64748B"/>
+          <w:sz w:val="20"/>
+        </w:rPr>
+        <w:t xml:space="preserve">  Hold the round mic button to record (round-trip with assistant reply played aloud), or the pencil mic for dictation into the input. Voice features need a real microphone and browser permission.</w:t>
       </w:r>
     </w:p>
     <w:p>
@@ -2514,7 +2081,7 @@
       <w:r>
         <w:drawing>
           <wp:inline xmlns:a="http://schemas.openxmlformats.org/drawingml/2006/main" xmlns:pic="http://schemas.openxmlformats.org/drawingml/2006/picture">
-            <wp:extent cx="5943600" cy="3807619"/>
+            <wp:extent cx="5486400" cy="4035206"/>
             <wp:docPr id="6" name="Picture 6"/>
             <wp:cNvGraphicFramePr>
               <a:graphicFrameLocks noChangeAspect="1"/>
@@ -2523,7 +2090,7 @@
               <a:graphicData uri="http://schemas.openxmlformats.org/drawingml/2006/picture">
                 <pic:pic>
                   <pic:nvPicPr>
-                    <pic:cNvPr id="0" name="08-audit-local.png"/>
+                    <pic:cNvPr id="0" name="10-chatbot-open.png"/>
                     <pic:cNvPicPr/>
                   </pic:nvPicPr>
                   <pic:blipFill>
@@ -2535,7 +2102,7 @@
                   <pic:spPr>
                     <a:xfrm>
                       <a:off x="0" y="0"/>
-                      <a:ext cx="5943600" cy="3807619"/>
+                      <a:ext cx="5486400" cy="4035206"/>
                     </a:xfrm>
                     <a:prstGeom prst="rect"/>
                   </pic:spPr>
@@ -2556,7 +2123,113 @@
           <w:color w:val="64748B"/>
           <w:sz w:val="18"/>
         </w:rPr>
-        <w:t>Figure — Audit Trail — Local tab</w:t>
+        <w:t>Figure — Chatbot drawer</w:t>
+      </w:r>
+    </w:p>
+    <w:p>
+      <w:pPr>
+        <w:pStyle w:val="ListBullet"/>
+      </w:pPr>
+      <w:r>
+        <w:rPr>
+          <w:color w:val="10B981"/>
+          <w:sz w:val="20"/>
+        </w:rPr>
+        <w:t>✓  Reply streams in within ~5 s.</w:t>
+      </w:r>
+    </w:p>
+    <w:p>
+      <w:pPr>
+        <w:pStyle w:val="ListBullet"/>
+      </w:pPr>
+      <w:r>
+        <w:rPr>
+          <w:color w:val="10B981"/>
+          <w:sz w:val="20"/>
+        </w:rPr>
+        <w:t>✓  Speaker icon plays audio with no console errors.</w:t>
+      </w:r>
+    </w:p>
+    <w:p>
+      <w:pPr>
+        <w:pStyle w:val="ListBullet"/>
+      </w:pPr>
+      <w:r>
+        <w:rPr>
+          <w:color w:val="DC2626"/>
+          <w:sz w:val="20"/>
+        </w:rPr>
+        <w:t>!  First voice request asks for mic permission — allow it. If denied, only text + speaker work.</w:t>
+      </w:r>
+    </w:p>
+    <w:p>
+      <w:r>
+        <w:br w:type="page"/>
+      </w:r>
+    </w:p>
+    <w:p>
+      <w:pPr>
+        <w:pStyle w:val="Heading1"/>
+      </w:pPr>
+      <w:r>
+        <w:rPr>
+          <w:color w:val="302D29"/>
+        </w:rPr>
+        <w:t>6. Audit trail</w:t>
+      </w:r>
+    </w:p>
+    <w:p>
+      <w:pPr>
+        <w:ind w:left="227"/>
+      </w:pPr>
+      <w:r>
+        <w:rPr>
+          <w:b/>
+          <w:color w:val="8B6914"/>
+          <w:sz w:val="22"/>
+        </w:rPr>
+        <w:t xml:space="preserve">1. </w:t>
+      </w:r>
+      <w:r>
+        <w:rPr>
+          <w:b/>
+          <w:sz w:val="22"/>
+        </w:rPr>
+        <w:t>Navigate to /audit-trail</w:t>
+      </w:r>
+      <w:r>
+        <w:rPr>
+          <w:color w:val="64748B"/>
+          <w:sz w:val="20"/>
+        </w:rPr>
+        <w:t xml:space="preserve">  Sidebar → Readiness &amp; Governance → Audit Trail.</w:t>
+      </w:r>
+    </w:p>
+    <w:p>
+      <w:pPr>
+        <w:ind w:left="227"/>
+      </w:pPr>
+      <w:r>
+        <w:rPr>
+          <w:b/>
+          <w:color w:val="8B6914"/>
+          <w:sz w:val="22"/>
+        </w:rPr>
+        <w:t xml:space="preserve">2. </w:t>
+      </w:r>
+      <w:r>
+        <w:rPr>
+          <w:b/>
+          <w:sz w:val="22"/>
+        </w:rPr>
+        <w:t>Switch to the 'AI Backend' tab</w:t>
+      </w:r>
+      <w:r>
+        <w:rPr>
+          <w:color w:val="64748B"/>
+          <w:sz w:val="20"/>
+        </w:rPr>
+        <w:t xml:space="preserve">  Pulls /api/v1/audit/all from the backend (every signature event since signup).</w:t>
       </w:r>
     </w:p>
     <w:p>
@@ -2566,7 +2239,7 @@
       <w:r>
         <w:drawing>
           <wp:inline xmlns:a="http://schemas.openxmlformats.org/drawingml/2006/main" xmlns:pic="http://schemas.openxmlformats.org/drawingml/2006/picture">
-            <wp:extent cx="5943600" cy="3807619"/>
+            <wp:extent cx="5486400" cy="4035206"/>
             <wp:docPr id="7" name="Picture 7"/>
             <wp:cNvGraphicFramePr>
               <a:graphicFrameLocks noChangeAspect="1"/>
@@ -2587,7 +2260,7 @@
                   <pic:spPr>
                     <a:xfrm>
                       <a:off x="0" y="0"/>
-                      <a:ext cx="5943600" cy="3807619"/>
+                      <a:ext cx="5486400" cy="4035206"/>
                     </a:xfrm>
                     <a:prstGeom prst="rect"/>
                   </pic:spPr>
@@ -2608,70 +2281,19 @@
           <w:color w:val="64748B"/>
           <w:sz w:val="18"/>
         </w:rPr>
-        <w:t>Figure — Audit Trail — AI Backend tab</w:t>
+        <w:t>Figure — AI Backend audit log</w:t>
       </w:r>
     </w:p>
     <w:p>
       <w:pPr>
-        <w:pStyle w:val="Heading3"/>
+        <w:pStyle w:val="ListBullet"/>
       </w:pPr>
       <w:r>
         <w:rPr>
-          <w:color w:val="302D29"/>
+          <w:color w:val="10B981"/>
+          <w:sz w:val="20"/>
         </w:rPr>
-        <w:t>Sample response</w:t>
-      </w:r>
-    </w:p>
-    <w:p>
-      <w:pPr>
-        <w:spacing w:after="120"/>
-        <w:ind w:left="283"/>
-      </w:pPr>
-      <w:r>
-        <w:rPr>
-          <w:rFonts w:ascii="Consolas" w:hAnsi="Consolas"/>
-          <w:sz w:val="18"/>
-          <w:rFonts w:ascii="Consolas" w:hAnsi="Consolas"/>
-        </w:rPr>
-        <w:t>GET /api/v1/audit/all</w:t>
-        <w:br/>
-        <w:t>Headers: auth: &lt;access_token&gt;</w:t>
-        <w:br/>
-        <w:br/>
-        <w:t>200 OK</w:t>
-        <w:br/>
-        <w:t>{</w:t>
-        <w:br/>
-        <w:t xml:space="preserve">  "total": 6,</w:t>
-        <w:br/>
-        <w:t xml:space="preserve">  "audit_logs": [</w:t>
-        <w:br/>
-        <w:t xml:space="preserve">    {</w:t>
-        <w:br/>
-        <w:t xml:space="preserve">      "audit_id": "AUDIT-20260430123026-ac1bd3b9",</w:t>
-        <w:br/>
-        <w:t xml:space="preserve">      "action_type": "create_capa",</w:t>
-        <w:br/>
-        <w:t xml:space="preserve">      "feature_id": "AI-100",</w:t>
-        <w:br/>
-        <w:t xml:space="preserve">      "record_id": "CAPA-2026-304",</w:t>
-        <w:br/>
-        <w:t xml:space="preserve">      "username": "qa_manager",</w:t>
-        <w:br/>
-        <w:t xml:space="preserve">      "status": "success",</w:t>
-        <w:br/>
-        <w:t xml:space="preserve">      "timestamp": "2026-04-30T12:30:26.951557"</w:t>
-        <w:br/>
-        <w:t xml:space="preserve">    }</w:t>
-        <w:br/>
-        <w:t xml:space="preserve">  ]</w:t>
-        <w:br/>
-        <w:t>}</w:t>
-      </w:r>
-    </w:p>
-    <w:p>
-      <w:r>
-        <w:br w:type="page"/>
+        <w:t>✓  Recent CAPA / RCA / Closure events appear with timestamps and audit IDs.</w:t>
       </w:r>
     </w:p>
     <w:p>
@@ -2682,7 +2304,7 @@
         <w:rPr>
           <w:color w:val="302D29"/>
         </w:rPr>
-        <w:t>8. AI Backend Tools</w:t>
+        <w:t>7. AI Tools (diagnostic page)</w:t>
       </w:r>
     </w:p>
     <w:p>
@@ -2692,7 +2314,81 @@
           <w:i w:val="0"/>
           <w:sz w:val="22"/>
         </w:rPr>
-        <w:t>The /ai-tools page exposes every endpoint that doesn't have a dedicated UI surface — mostly the *Status/{id} GETs (which are redundant with the *ByCapa GETs already on the lifecycle page), plus audit/record, users/, and the two health checks. Each card mirrors the AI-Generated CAPA modal pattern: a header, a single input, a Submit button, and a JSON result panel.</w:t>
+        <w:t>Direct lookups for every AI backend endpoint by ID. Useful for spot-checking what was just submitted, or for verifying that a stage's audit record actually exists.</w:t>
+      </w:r>
+    </w:p>
+    <w:p>
+      <w:pPr>
+        <w:ind w:left="227"/>
+      </w:pPr>
+      <w:r>
+        <w:rPr>
+          <w:b/>
+          <w:color w:val="8B6914"/>
+          <w:sz w:val="22"/>
+        </w:rPr>
+        <w:t xml:space="preserve">1. </w:t>
+      </w:r>
+      <w:r>
+        <w:rPr>
+          <w:b/>
+          <w:sz w:val="22"/>
+        </w:rPr>
+        <w:t>Navigate to /ai-tools</w:t>
+      </w:r>
+    </w:p>
+    <w:p>
+      <w:pPr>
+        <w:ind w:left="227"/>
+      </w:pPr>
+      <w:r>
+        <w:rPr>
+          <w:b/>
+          <w:color w:val="8B6914"/>
+          <w:sz w:val="22"/>
+        </w:rPr>
+        <w:t xml:space="preserve">2. </w:t>
+      </w:r>
+      <w:r>
+        <w:rPr>
+          <w:b/>
+          <w:sz w:val="22"/>
+        </w:rPr>
+        <w:t>Ping the diagnostics</w:t>
+      </w:r>
+      <w:r>
+        <w:rPr>
+          <w:color w:val="64748B"/>
+          <w:sz w:val="20"/>
+        </w:rPr>
+        <w:t xml:space="preserve">  AI Assistant health, AI Voice health, Users — all should return 200 with JSON.</w:t>
+      </w:r>
+    </w:p>
+    <w:p>
+      <w:pPr>
+        <w:ind w:left="227"/>
+      </w:pPr>
+      <w:r>
+        <w:rPr>
+          <w:b/>
+          <w:color w:val="8B6914"/>
+          <w:sz w:val="22"/>
+        </w:rPr>
+        <w:t xml:space="preserve">3. </w:t>
+      </w:r>
+      <w:r>
+        <w:rPr>
+          <w:b/>
+          <w:sz w:val="22"/>
+        </w:rPr>
+        <w:t>Look up a stage by ID</w:t>
+      </w:r>
+      <w:r>
+        <w:rPr>
+          <w:color w:val="64748B"/>
+          <w:sz w:val="20"/>
+        </w:rPr>
+        <w:t xml:space="preserve">  Paste an RCA / Action Plan / Monitoring / Effectiveness / Closure / Audit ID returned earlier and click Submit.</w:t>
       </w:r>
     </w:p>
     <w:p>
@@ -2702,7 +2398,7 @@
       <w:r>
         <w:drawing>
           <wp:inline xmlns:a="http://schemas.openxmlformats.org/drawingml/2006/main" xmlns:pic="http://schemas.openxmlformats.org/drawingml/2006/picture">
-            <wp:extent cx="5943600" cy="3807619"/>
+            <wp:extent cx="5486400" cy="4035206"/>
             <wp:docPr id="8" name="Picture 8"/>
             <wp:cNvGraphicFramePr>
               <a:graphicFrameLocks noChangeAspect="1"/>
@@ -2723,7 +2419,7 @@
                   <pic:spPr>
                     <a:xfrm>
                       <a:off x="0" y="0"/>
-                      <a:ext cx="5943600" cy="3807619"/>
+                      <a:ext cx="5486400" cy="4035206"/>
                     </a:xfrm>
                     <a:prstGeom prst="rect"/>
                   </pic:spPr>
@@ -2744,49 +2440,31 @@
           <w:color w:val="64748B"/>
           <w:sz w:val="18"/>
         </w:rPr>
-        <w:t>Figure — AI Backend Tools page</w:t>
+        <w:t>Figure — AI Tools page</w:t>
       </w:r>
     </w:p>
     <w:p>
       <w:pPr>
-        <w:pStyle w:val="Heading3"/>
+        <w:pStyle w:val="ListBullet"/>
       </w:pPr>
       <w:r>
         <w:rPr>
-          <w:color w:val="302D29"/>
+          <w:color w:val="10B981"/>
+          <w:sz w:val="20"/>
         </w:rPr>
-        <w:t>Sample diagnostic responses</w:t>
+        <w:t>✓  All three health pings return 200.</w:t>
       </w:r>
     </w:p>
     <w:p>
       <w:pPr>
-        <w:spacing w:after="120"/>
-        <w:ind w:left="283"/>
+        <w:pStyle w:val="ListBullet"/>
       </w:pPr>
       <w:r>
         <w:rPr>
-          <w:rFonts w:ascii="Consolas" w:hAnsi="Consolas"/>
-          <w:sz w:val="18"/>
-          <w:rFonts w:ascii="Consolas" w:hAnsi="Consolas"/>
+          <w:color w:val="10B981"/>
+          <w:sz w:val="20"/>
         </w:rPr>
-        <w:t>GET /api/ai/health        → {"status": "AI assistant is running ✅"}</w:t>
-        <w:br/>
-        <w:t>GET /api/ai/voice/health  → {</w:t>
-        <w:br/>
-        <w:t xml:space="preserve">  "status": "Voice endpoints running ✅",</w:t>
-        <w:br/>
-        <w:t xml:space="preserve">  "endpoints": {"transcribe": "POST /api/ai/voice/transcribe",</w:t>
-        <w:br/>
-        <w:t xml:space="preserve">                "speak":      "POST /api/ai/voice/speak",</w:t>
-        <w:br/>
-        <w:t xml:space="preserve">                "voice_chat": "POST /api/ai/voice/chat"},</w:t>
-        <w:br/>
-        <w:t xml:space="preserve">  "voices": ["alloy","echo","fable","onyx","nova","shimmer"]</w:t>
-        <w:br/>
-        <w:t>}</w:t>
-        <w:br/>
-        <w:t>GET /api/v1/users/         → {"message": "Users endpoint working ✅"}</w:t>
-        <w:br/>
+        <w:t>✓  ID lookups for the records you submitted return their full payload.</w:t>
       </w:r>
     </w:p>
     <w:p>
@@ -2802,212 +2480,103 @@
         <w:rPr>
           <w:color w:val="302D29"/>
         </w:rPr>
-        <w:t>9. Floating AI Chatbot</w:t>
-      </w:r>
-    </w:p>
-    <w:p>
-      <w:r>
-        <w:rPr>
-          <w:b w:val="0"/>
-          <w:i w:val="0"/>
-          <w:sz w:val="22"/>
-        </w:rPr>
-        <w:t>Every authenticated page (except /login and /site-picker) carries a floating chatbot bubble bottom-right. Read-only viewers don't see it. Right-click and drag the bubble to move it; position is cached per browser. Click to open the panel.</w:t>
+        <w:t>8. Pass criteria</w:t>
       </w:r>
     </w:p>
     <w:p>
       <w:pPr>
-        <w:jc w:val="center"/>
+        <w:pStyle w:val="ListBullet"/>
       </w:pPr>
       <w:r>
-        <w:drawing>
-          <wp:inline xmlns:a="http://schemas.openxmlformats.org/drawingml/2006/main" xmlns:pic="http://schemas.openxmlformats.org/drawingml/2006/picture">
-            <wp:extent cx="5943600" cy="3807619"/>
-            <wp:docPr id="9" name="Picture 9"/>
-            <wp:cNvGraphicFramePr>
-              <a:graphicFrameLocks noChangeAspect="1"/>
-            </wp:cNvGraphicFramePr>
-            <a:graphic>
-              <a:graphicData uri="http://schemas.openxmlformats.org/drawingml/2006/picture">
-                <pic:pic>
-                  <pic:nvPicPr>
-                    <pic:cNvPr id="0" name="10-chatbot-open.png"/>
-                    <pic:cNvPicPr/>
-                  </pic:nvPicPr>
-                  <pic:blipFill>
-                    <a:blip r:embed="rId17"/>
-                    <a:stretch>
-                      <a:fillRect/>
-                    </a:stretch>
-                  </pic:blipFill>
-                  <pic:spPr>
-                    <a:xfrm>
-                      <a:off x="0" y="0"/>
-                      <a:ext cx="5943600" cy="3807619"/>
-                    </a:xfrm>
-                    <a:prstGeom prst="rect"/>
-                  </pic:spPr>
-                </pic:pic>
-              </a:graphicData>
-            </a:graphic>
-          </wp:inline>
-        </w:drawing>
+        <w:rPr>
+          <w:color w:val="10B981"/>
+          <w:sz w:val="20"/>
+        </w:rPr>
+        <w:t>✓  Sign-in works and aiAccessToken is cached (check via DevTools → Application → Local Storage → glimmora-state).</w:t>
       </w:r>
     </w:p>
     <w:p>
       <w:pPr>
-        <w:jc w:val="center"/>
+        <w:pStyle w:val="ListBullet"/>
       </w:pPr>
       <w:r>
         <w:rPr>
-          <w:i/>
-          <w:color w:val="64748B"/>
-          <w:sz w:val="18"/>
+          <w:color w:val="10B981"/>
+          <w:sz w:val="20"/>
         </w:rPr>
-        <w:t>Figure — Floating chatbot — empty panel</w:t>
+        <w:t>✓  AI CAPA creation returns a CAPA ID with risk score and AI recommendation.</w:t>
       </w:r>
     </w:p>
     <w:p>
       <w:pPr>
-        <w:pStyle w:val="Heading2"/>
+        <w:pStyle w:val="ListBullet"/>
       </w:pPr>
       <w:r>
         <w:rPr>
-          <w:color w:val="302D29"/>
+          <w:color w:val="10B981"/>
+          <w:sz w:val="20"/>
         </w:rPr>
-        <w:t>Text mode</w:t>
-      </w:r>
-    </w:p>
-    <w:p>
-      <w:r>
-        <w:rPr>
-          <w:b w:val="0"/>
-          <w:i w:val="0"/>
-          <w:sz w:val="22"/>
-        </w:rPr>
-        <w:t>Type into the input box and press Enter to send. The full running history is sent with each message so the assistant answers in context.</w:t>
+        <w:t>✓  All 5 lifecycle stages submit cleanly and the status field advances correctly.</w:t>
       </w:r>
     </w:p>
     <w:p>
       <w:pPr>
-        <w:spacing w:after="120"/>
-        <w:ind w:left="283"/>
+        <w:pStyle w:val="ListBullet"/>
       </w:pPr>
       <w:r>
         <w:rPr>
-          <w:rFonts w:ascii="Consolas" w:hAnsi="Consolas"/>
-          <w:sz w:val="18"/>
-          <w:rFonts w:ascii="Consolas" w:hAnsi="Consolas"/>
+          <w:color w:val="10B981"/>
+          <w:sz w:val="20"/>
         </w:rPr>
-        <w:t>POST /api/ai/chat</w:t>
-        <w:br/>
-        <w:t>Headers: auth: &lt;access_token&gt;</w:t>
-        <w:br/>
-        <w:br/>
-        <w:t>{</w:t>
-        <w:br/>
-        <w:t xml:space="preserve">  "message": "How many CAPAs are open right now?",</w:t>
-        <w:br/>
-        <w:t xml:space="preserve">  "chat_history": [</w:t>
-        <w:br/>
-        <w:t xml:space="preserve">    {"role": "user", "content": "Tell me about CAPAs"},</w:t>
-        <w:br/>
-        <w:t xml:space="preserve">    {"role": "assistant", "content": "A CAPA is …"}</w:t>
-        <w:br/>
-        <w:t xml:space="preserve">  ]</w:t>
-        <w:br/>
-        <w:t>}</w:t>
-        <w:br/>
-        <w:br/>
-        <w:t>200 OK</w:t>
-        <w:br/>
-        <w:t>{</w:t>
-        <w:br/>
-        <w:t xml:space="preserve">  "reply": "There are currently 3 open CAPAs for CUST_001 …",</w:t>
-        <w:br/>
-        <w:t xml:space="preserve">  "intent": "DB_QUERY",</w:t>
-        <w:br/>
-        <w:t xml:space="preserve">  "customer_id": "CUST_001"</w:t>
-        <w:br/>
-        <w:t>}</w:t>
+        <w:t>✓  Recurrence alert (when triggered) requires reason + signature before dismissal.</w:t>
       </w:r>
     </w:p>
     <w:p>
       <w:pPr>
-        <w:pStyle w:val="Heading2"/>
+        <w:pStyle w:val="ListBullet"/>
       </w:pPr>
       <w:r>
         <w:rPr>
-          <w:color w:val="302D29"/>
+          <w:color w:val="10B981"/>
+          <w:sz w:val="20"/>
         </w:rPr>
-        <w:t>Voice round-trip (mic button)</w:t>
-      </w:r>
-    </w:p>
-    <w:p>
-      <w:r>
-        <w:rPr>
-          <w:b w:val="0"/>
-          <w:i w:val="0"/>
-          <w:sz w:val="22"/>
-        </w:rPr>
-        <w:t>Click the mic button to record. The signal flows through a real-time DSP cleanup chain (high-pass → RNNoise → compressor → make-up gain) before it reaches Whisper, so background noise is suppressed at speech-recognition quality. A live VU-meter shows the audio level; the recording ends when you click Stop. After the preview, click Send to upload to /api/ai/voice/chat — the backend transcribes, generates a reply, and returns audio that auto-plays. The transcript and assistant text are also rendered in the chat for review.</w:t>
-      </w:r>
-    </w:p>
-    <w:p>
-      <w:r>
-        <w:rPr>
-          <w:b w:val="0"/>
-          <w:i w:val="0"/>
-          <w:sz w:val="22"/>
-        </w:rPr>
-        <w:t>The gear icon in the chatbot header opens a settings drawer with a Noise suppression slider (0% = raw mic, 100% = full RNNoise wet signal). Setting persists across reloads and live-updates while you record.</w:t>
+        <w:t>✓  Chatbot replies arrive within ~5 s; speaker playback works.</w:t>
       </w:r>
     </w:p>
     <w:p>
       <w:pPr>
-        <w:pStyle w:val="Heading2"/>
+        <w:pStyle w:val="ListBullet"/>
       </w:pPr>
       <w:r>
         <w:rPr>
-          <w:color w:val="302D29"/>
+          <w:color w:val="10B981"/>
+          <w:sz w:val="20"/>
         </w:rPr>
-        <w:t>Dictate (Edit pencil button)</w:t>
-      </w:r>
-    </w:p>
-    <w:p>
-      <w:r>
-        <w:rPr>
-          <w:b w:val="0"/>
-          <w:i w:val="0"/>
-          <w:sz w:val="22"/>
-        </w:rPr>
-        <w:t>The pencil icon next to the mic uses /api/ai/voice/transcribe to drop your speech into the input box as text. Useful when you want to review and edit before sending.</w:t>
+        <w:t>✓  Audit trail AI tab is populated with the events you triggered.</w:t>
       </w:r>
     </w:p>
     <w:p>
       <w:pPr>
-        <w:pStyle w:val="Heading2"/>
+        <w:pStyle w:val="ListBullet"/>
       </w:pPr>
       <w:r>
         <w:rPr>
-          <w:color w:val="302D29"/>
+          <w:color w:val="10B981"/>
+          <w:sz w:val="20"/>
         </w:rPr>
-        <w:t>Speak this reply (speaker icon on assistant bubble)</w:t>
+        <w:t>✓  AI Tools health pings + ID lookups all return 200.</w:t>
       </w:r>
     </w:p>
     <w:p>
+      <w:pPr>
+        <w:pStyle w:val="ListBullet"/>
+      </w:pPr>
       <w:r>
         <w:rPr>
-          <w:b w:val="0"/>
-          <w:i w:val="0"/>
-          <w:sz w:val="22"/>
+          <w:color w:val="10B981"/>
+          <w:sz w:val="20"/>
         </w:rPr>
-        <w:t>Every assistant text message has a small speaker icon. Click to call /api/ai/voice/speak with voice="nova" and play the audio.</w:t>
-      </w:r>
-    </w:p>
-    <w:p>
-      <w:r>
-        <w:br w:type="page"/>
+        <w:t>✓  Browser console shows 0 errors at every page (browser-native 4xx logs are fine — those are the only ones you can't suppress and they don't indicate a bug).</w:t>
       </w:r>
     </w:p>
     <w:p>
@@ -3018,266 +2587,43 @@
         <w:rPr>
           <w:color w:val="302D29"/>
         </w:rPr>
-        <w:t>10. User signup flows</w:t>
-      </w:r>
-    </w:p>
-    <w:p>
-      <w:r>
-        <w:rPr>
-          <w:b w:val="0"/>
-          <w:i w:val="0"/>
-          <w:sz w:val="22"/>
-        </w:rPr>
-        <w:t>Three places in the app create users on the AI backend, all via /api/v1/auth/signup:</w:t>
-      </w:r>
-    </w:p>
-    <w:p>
-      <w:r>
-        <w:rPr>
-          <w:b w:val="0"/>
-          <w:i w:val="0"/>
-          <w:sz w:val="20"/>
-        </w:rPr>
-        <w:t>1. Customer Accounts (super admin) — when a new customer is created, the customer admin is registered with a generated CUST_xxx that becomes both customer_id and user_id.</w:t>
-      </w:r>
-    </w:p>
-    <w:p>
-      <w:r>
-        <w:rPr>
-          <w:b w:val="0"/>
-          <w:i w:val="0"/>
-          <w:sz w:val="20"/>
-        </w:rPr>
-        <w:t>2. Settings → Users (customer admin) — when a tenant user is added, signup runs with the user's id as user_id and the customer admin's CUST_xxx as customer_id.</w:t>
-      </w:r>
-    </w:p>
-    <w:p>
-      <w:r>
-        <w:rPr>
-          <w:b w:val="0"/>
-          <w:i w:val="0"/>
-          <w:sz w:val="20"/>
-        </w:rPr>
-        <w:t>3. Login self-heal — if the user logs in but isn't registered yet (e.g. seeded mock accounts), refreshAiToken auto-runs signup with the credentials they typed.</w:t>
+        <w:t>9. Known caveats</w:t>
       </w:r>
     </w:p>
     <w:p>
       <w:pPr>
-        <w:pStyle w:val="Heading3"/>
+        <w:pStyle w:val="ListBullet"/>
       </w:pPr>
       <w:r>
         <w:rPr>
-          <w:color w:val="302D29"/>
+          <w:color w:val="DC2626"/>
+          <w:sz w:val="20"/>
         </w:rPr>
-        <w:t>Sample signup payload</w:t>
+        <w:t>!  Render free-tier dyno sleeps after ~15 min idle. First request after wake-up takes ~30 s — this is expected, not a bug.</w:t>
       </w:r>
     </w:p>
     <w:p>
       <w:pPr>
-        <w:spacing w:after="120"/>
-        <w:ind w:left="283"/>
+        <w:pStyle w:val="ListBullet"/>
       </w:pPr>
       <w:r>
         <w:rPr>
-          <w:rFonts w:ascii="Consolas" w:hAnsi="Consolas"/>
-          <w:sz w:val="18"/>
-          <w:rFonts w:ascii="Consolas" w:hAnsi="Consolas"/>
-        </w:rPr>
-        <w:t>POST /api/v1/auth/signup</w:t>
-        <w:br/>
-        <w:t>Content-Type: application/json</w:t>
-        <w:br/>
-        <w:br/>
-        <w:t>{</w:t>
-        <w:br/>
-        <w:t xml:space="preserve">  "user_id": "USER-A1B2C3D4",</w:t>
-        <w:br/>
-        <w:t xml:space="preserve">  "username": "ramu",</w:t>
-        <w:br/>
-        <w:t xml:space="preserve">  "email": "ramu@example.com",</w:t>
-        <w:br/>
-        <w:t xml:space="preserve">  "password": "secret",</w:t>
-        <w:br/>
-        <w:t xml:space="preserve">  "customer_id": "CUST_001",</w:t>
-        <w:br/>
-        <w:t xml:space="preserve">  "role": "qa_manager"</w:t>
-        <w:br/>
-        <w:t>}</w:t>
-        <w:br/>
-        <w:br/>
-        <w:t>201 Created</w:t>
-        <w:br/>
-        <w:t>{</w:t>
-        <w:br/>
-        <w:t xml:space="preserve">  "access_token": "eyJ…",</w:t>
-        <w:br/>
-        <w:t xml:space="preserve">  "token_type": "Bearer",</w:t>
-        <w:br/>
-        <w:t xml:space="preserve">  "username": "ramu",</w:t>
-        <w:br/>
-        <w:t xml:space="preserve">  "customer_id": "CUST_001",</w:t>
-        <w:br/>
-        <w:t xml:space="preserve">  "role": "qa_manager",</w:t>
-        <w:br/>
-        <w:t xml:space="preserve">  "message": "✅ Account created for ramu."</w:t>
-        <w:br/>
-        <w:t>}</w:t>
-      </w:r>
-    </w:p>
-    <w:p>
-      <w:r>
-        <w:rPr>
-          <w:b w:val="0"/>
-          <w:i/>
+          <w:color w:val="DC2626"/>
           <w:sz w:val="20"/>
         </w:rPr>
-        <w:t>Validation rules (backend): username ≥ 1 char, password ≥ 1 char, email ≥ 5 chars. user_id and customer_id are opaque strings — the frontend generates user_id values on demand.</w:t>
-      </w:r>
-    </w:p>
-    <w:p>
-      <w:r>
-        <w:br w:type="page"/>
+        <w:t>!  Render's SQLite DB is not persistent across cold restarts. CAPAs you created earlier may return 404 the next day; just create fresh ones.</w:t>
       </w:r>
     </w:p>
     <w:p>
       <w:pPr>
-        <w:pStyle w:val="Heading1"/>
+        <w:pStyle w:val="ListBullet"/>
       </w:pPr>
       <w:r>
         <w:rPr>
-          <w:color w:val="302D29"/>
-        </w:rPr>
-        <w:t>Appendix A — Quick reference</w:t>
-      </w:r>
-    </w:p>
-    <w:p>
-      <w:pPr>
-        <w:pStyle w:val="Heading2"/>
-      </w:pPr>
-      <w:r>
-        <w:rPr>
-          <w:color w:val="302D29"/>
-        </w:rPr>
-        <w:t>Roles and visibility</w:t>
-      </w:r>
-    </w:p>
-    <w:p>
-      <w:r>
-        <w:rPr>
-          <w:b w:val="0"/>
-          <w:i w:val="0"/>
+          <w:color w:val="DC2626"/>
           <w:sz w:val="20"/>
         </w:rPr>
-        <w:t>• super_admin / customer_admin / qa_head / qc_lab_director / regulatory_affairs / csv_val_lead / it_cdo / operations_head / viewer</w:t>
-      </w:r>
-    </w:p>
-    <w:p>
-      <w:r>
-        <w:rPr>
-          <w:b w:val="0"/>
-          <w:i w:val="0"/>
-          <w:sz w:val="20"/>
-        </w:rPr>
-        <w:t>• Floating chatbot: visible to all roles except viewer.</w:t>
-      </w:r>
-    </w:p>
-    <w:p>
-      <w:r>
-        <w:rPr>
-          <w:b w:val="0"/>
-          <w:i w:val="0"/>
-          <w:sz w:val="20"/>
-        </w:rPr>
-        <w:t>• AI CAPA button on Tracker: customer_admin and any role with create permission.</w:t>
-      </w:r>
-    </w:p>
-    <w:p>
-      <w:r>
-        <w:rPr>
-          <w:b w:val="0"/>
-          <w:i w:val="0"/>
-          <w:sz w:val="20"/>
-        </w:rPr>
-        <w:t>• /ai-capa, /ai-capa/[id], /ai-tools, /audit-trail: every authenticated user.</w:t>
-      </w:r>
-    </w:p>
-    <w:p>
-      <w:pPr>
-        <w:pStyle w:val="Heading2"/>
-      </w:pPr>
-      <w:r>
-        <w:rPr>
-          <w:color w:val="302D29"/>
-        </w:rPr>
-        <w:t>Common error responses</w:t>
-      </w:r>
-    </w:p>
-    <w:p>
-      <w:pPr>
-        <w:spacing w:after="120"/>
-        <w:ind w:left="283"/>
-      </w:pPr>
-      <w:r>
-        <w:rPr>
-          <w:rFonts w:ascii="Consolas" w:hAnsi="Consolas"/>
-          <w:sz w:val="18"/>
-          <w:rFonts w:ascii="Consolas" w:hAnsi="Consolas"/>
-        </w:rPr>
-        <w:t>401 Invalid username or password.        wrong creds on /auth/login</w:t>
-        <w:br/>
-        <w:t>401 Invalid token. Please login.         missing or expired auth header</w:t>
-        <w:br/>
-        <w:t>422 Field required …                     missing form/body field</w:t>
-        <w:br/>
-        <w:t>404 (no body)                            not-yet-submitted stage on a *ByCapa GET</w:t>
-        <w:br/>
-        <w:t>500 AI chat failed: &lt;ExceptionType&gt;      uncaught error inside chat() / RAG / DB</w:t>
-        <w:br/>
-      </w:r>
-    </w:p>
-    <w:p>
-      <w:pPr>
-        <w:pStyle w:val="Heading2"/>
-      </w:pPr>
-      <w:r>
-        <w:rPr>
-          <w:color w:val="302D29"/>
-        </w:rPr>
-        <w:t>Console logging</w:t>
-      </w:r>
-    </w:p>
-    <w:p>
-      <w:r>
-        <w:rPr>
-          <w:b w:val="0"/>
-          <w:i w:val="0"/>
-          <w:sz w:val="20"/>
-        </w:rPr>
-        <w:t>Every API call from the frontend logs to the browser console in a consistent format:</w:t>
-      </w:r>
-    </w:p>
-    <w:p>
-      <w:pPr>
-        <w:spacing w:after="120"/>
-        <w:ind w:left="283"/>
-      </w:pPr>
-      <w:r>
-        <w:rPr>
-          <w:rFonts w:ascii="Consolas" w:hAnsi="Consolas"/>
-          <w:sz w:val="18"/>
-          <w:rFonts w:ascii="Consolas" w:hAnsi="Consolas"/>
-        </w:rPr>
-        <w:t>[aiAuth]    POST /api/v1/auth/login → sending {username: …, password: ***}</w:t>
-        <w:br/>
-        <w:t>[aiAuth]    POST /api/v1/auth/login ✓ 200 (1841ms) {access_token: …}</w:t>
-        <w:br/>
-        <w:t>[aiBackend] POST /api/v1/capa/create → sending</w:t>
-        <w:br/>
-        <w:t>[aiBackend] POST /api/v1/capa/create ✓ 201 (1142ms)</w:t>
-        <w:br/>
-        <w:t>[aiChat]    POST /api/ai/chat → sending</w:t>
-        <w:br/>
-        <w:t>[aiChat]    POST /api/ai/chat ✓ 200 (4126ms)</w:t>
+        <w:t>!  Voice round-trip needs HTTPS or localhost AND a real mic. Playwright cannot exercise it.</w:t>
       </w:r>
     </w:p>
     <w:sectPr>
@@ -3653,10 +2999,6 @@
     <w:name w:val="Normal"/>
     <w:qFormat/>
     <w:rsid w:val="00FC693F"/>
-    <w:rPr>
-      <w:rFonts w:ascii="Segoe UI" w:hAnsi="Segoe UI"/>
-      <w:sz w:val="22"/>
-    </w:rPr>
   </w:style>
   <w:style w:type="paragraph" w:styleId="Header">
     <w:name w:val="header"/>

</xml_diff>